<commit_message>
fix(demo): give the demo document's default style a paragraph rhythm
The source declares an empty `w:pPrDefault` and a `Normal` with no `w:pPr`, so
445 of its 635 paragraphs inherit no spacing at all. The authored body text
hides that by carrying `w:spacing` on each paragraph directly, but anything the
editor creates inherits instead — press Enter at the end of a heading and the
new paragraph came out with its lines packed together. The builder now writes
Word's own 8pt-after, 1.08-line rhythm into `w:pPrDefault`, the same values the
blank template ships.

Co-Authored-By: Claude Opus 5 (1M context) <noreply@anthropic.com>
Claude-Session: https://claude.ai/code/session_01YVYKk3RgMDrUQRSWFDNHqK
</commit_message>
<xml_diff>
--- a/examples/astro/public/sample.docx
+++ b/examples/astro/public/sample.docx
@@ -15612,7 +15612,11 @@
         <w:szCs w:val="22"/>
       </w:rPr>
     </w:rPrDefault>
-    <w:pPrDefault/>
+    <w:pPrDefault>
+      <w:pPr>
+        <w:spacing w:after="160" w:line="259" w:lineRule="auto"/>
+      </w:pPr>
+    </w:pPrDefault>
   </w:docDefaults>
   <w:style w:type="paragraph" w:default="1" w:styleId="Normal">
     <w:name w:val="Normal"/>

</xml_diff>

<commit_message>
fix(demo): hold the TOC and table cells at the spacing they had
The rhythm went into `w:pPrDefault`, which is the bottom of the cascade, so it
reached every paragraph that states no `w:after` of its own — the TOC's 67
entries and 325 table-cell paragraphs among them. Word keeps those closed
through its TOC and table styles; this document names TOC styles it never
defines and its 15 tables name no table style at all, so the zero goes on the
paragraphs. Drops the 1.08 line rule too: a line rule set in the defaults
restyles text in an already-authored document, and the gap is what was missing.

Every table height, the TOC pitch and the page count now match the document
before the change; only body paragraphs gained the gap.

Co-Authored-By: Claude Opus 5 (1M context) <noreply@anthropic.com>
Claude-Session: https://claude.ai/code/session_01YVYKk3RgMDrUQRSWFDNHqK
</commit_message>
<xml_diff>
--- a/examples/astro/public/sample.docx
+++ b/examples/astro/public/sample.docx
@@ -217,7 +217,7 @@
             <w:tabs>
               <w:tab w:val="right" w:pos="9350" w:leader="dot"/>
             </w:tabs>
-            <w:spacing w:line="276" w:lineRule="auto"/>
+            <w:spacing w:after="0" w:line="276" w:lineRule="auto"/>
           </w:pPr>
           <w:hyperlink w:anchor="_Toc1607968921">
             <w:r>
@@ -237,7 +237,7 @@
             <w:tabs>
               <w:tab w:val="right" w:pos="9350" w:leader="dot"/>
             </w:tabs>
-            <w:spacing w:line="276" w:lineRule="auto"/>
+            <w:spacing w:after="0" w:line="276" w:lineRule="auto"/>
           </w:pPr>
           <w:hyperlink w:anchor="_Toc546987748">
             <w:r>
@@ -257,7 +257,7 @@
             <w:tabs>
               <w:tab w:val="right" w:pos="9350" w:leader="dot"/>
             </w:tabs>
-            <w:spacing w:line="276" w:lineRule="auto"/>
+            <w:spacing w:after="0" w:line="276" w:lineRule="auto"/>
             <w:ind w:left="240"/>
           </w:pPr>
           <w:hyperlink w:anchor="_Toc1634277685">
@@ -278,7 +278,7 @@
             <w:tabs>
               <w:tab w:val="right" w:pos="9350" w:leader="dot"/>
             </w:tabs>
-            <w:spacing w:line="276" w:lineRule="auto"/>
+            <w:spacing w:after="0" w:line="276" w:lineRule="auto"/>
             <w:ind w:left="240"/>
           </w:pPr>
           <w:hyperlink w:anchor="_Toc62270262">
@@ -299,7 +299,7 @@
             <w:tabs>
               <w:tab w:val="right" w:pos="9350" w:leader="dot"/>
             </w:tabs>
-            <w:spacing w:line="276" w:lineRule="auto"/>
+            <w:spacing w:after="0" w:line="276" w:lineRule="auto"/>
             <w:ind w:left="240"/>
           </w:pPr>
           <w:hyperlink w:anchor="_Toc1956756636">
@@ -320,7 +320,7 @@
             <w:tabs>
               <w:tab w:val="right" w:pos="9350" w:leader="dot"/>
             </w:tabs>
-            <w:spacing w:line="276" w:lineRule="auto"/>
+            <w:spacing w:after="0" w:line="276" w:lineRule="auto"/>
             <w:ind w:left="240"/>
           </w:pPr>
           <w:hyperlink w:anchor="_Toc1885470723">
@@ -341,7 +341,7 @@
             <w:tabs>
               <w:tab w:val="right" w:pos="9350" w:leader="dot"/>
             </w:tabs>
-            <w:spacing w:line="276" w:lineRule="auto"/>
+            <w:spacing w:after="0" w:line="276" w:lineRule="auto"/>
             <w:ind w:left="240"/>
           </w:pPr>
           <w:hyperlink w:anchor="_Toc1315151048">
@@ -362,7 +362,7 @@
             <w:tabs>
               <w:tab w:val="right" w:pos="9350" w:leader="dot"/>
             </w:tabs>
-            <w:spacing w:line="276" w:lineRule="auto"/>
+            <w:spacing w:after="0" w:line="276" w:lineRule="auto"/>
           </w:pPr>
           <w:hyperlink w:anchor="_Toc688382689">
             <w:r>
@@ -382,7 +382,7 @@
             <w:tabs>
               <w:tab w:val="right" w:pos="9350" w:leader="dot"/>
             </w:tabs>
-            <w:spacing w:line="276" w:lineRule="auto"/>
+            <w:spacing w:after="0" w:line="276" w:lineRule="auto"/>
           </w:pPr>
           <w:hyperlink w:anchor="_Toc124547945">
             <w:r>
@@ -402,7 +402,7 @@
             <w:tabs>
               <w:tab w:val="right" w:pos="9350" w:leader="dot"/>
             </w:tabs>
-            <w:spacing w:line="276" w:lineRule="auto"/>
+            <w:spacing w:after="0" w:line="276" w:lineRule="auto"/>
             <w:ind w:left="240"/>
           </w:pPr>
           <w:hyperlink w:anchor="_Toc1532011488">
@@ -423,7 +423,7 @@
             <w:tabs>
               <w:tab w:val="right" w:pos="9350" w:leader="dot"/>
             </w:tabs>
-            <w:spacing w:line="276" w:lineRule="auto"/>
+            <w:spacing w:after="0" w:line="276" w:lineRule="auto"/>
             <w:ind w:left="480"/>
           </w:pPr>
           <w:hyperlink w:anchor="_Toc1575251699">
@@ -444,7 +444,7 @@
             <w:tabs>
               <w:tab w:val="right" w:pos="9350" w:leader="dot"/>
             </w:tabs>
-            <w:spacing w:line="276" w:lineRule="auto"/>
+            <w:spacing w:after="0" w:line="276" w:lineRule="auto"/>
             <w:ind w:left="720"/>
           </w:pPr>
           <w:hyperlink w:anchor="_Toc17297265">
@@ -465,7 +465,7 @@
             <w:tabs>
               <w:tab w:val="right" w:pos="9350" w:leader="dot"/>
             </w:tabs>
-            <w:spacing w:line="276" w:lineRule="auto"/>
+            <w:spacing w:after="0" w:line="276" w:lineRule="auto"/>
             <w:ind w:left="960"/>
           </w:pPr>
           <w:hyperlink w:anchor="_Toc1540657169">
@@ -486,7 +486,7 @@
             <w:tabs>
               <w:tab w:val="right" w:pos="9350" w:leader="dot"/>
             </w:tabs>
-            <w:spacing w:line="276" w:lineRule="auto"/>
+            <w:spacing w:after="0" w:line="276" w:lineRule="auto"/>
           </w:pPr>
           <w:hyperlink w:anchor="_Toc2066459084">
             <w:r>
@@ -506,7 +506,7 @@
             <w:tabs>
               <w:tab w:val="right" w:pos="9350" w:leader="dot"/>
             </w:tabs>
-            <w:spacing w:line="276" w:lineRule="auto"/>
+            <w:spacing w:after="0" w:line="276" w:lineRule="auto"/>
             <w:ind w:left="240"/>
           </w:pPr>
           <w:hyperlink w:anchor="_Toc976116570">
@@ -527,7 +527,7 @@
             <w:tabs>
               <w:tab w:val="right" w:pos="9350" w:leader="dot"/>
             </w:tabs>
-            <w:spacing w:line="276" w:lineRule="auto"/>
+            <w:spacing w:after="0" w:line="276" w:lineRule="auto"/>
             <w:ind w:left="240"/>
           </w:pPr>
           <w:hyperlink w:anchor="_Toc878654627">
@@ -548,7 +548,7 @@
             <w:tabs>
               <w:tab w:val="right" w:pos="9350" w:leader="dot"/>
             </w:tabs>
-            <w:spacing w:line="276" w:lineRule="auto"/>
+            <w:spacing w:after="0" w:line="276" w:lineRule="auto"/>
             <w:ind w:left="240"/>
           </w:pPr>
           <w:hyperlink w:anchor="_Toc1473112672">
@@ -569,7 +569,7 @@
             <w:tabs>
               <w:tab w:val="right" w:pos="9350" w:leader="dot"/>
             </w:tabs>
-            <w:spacing w:line="276" w:lineRule="auto"/>
+            <w:spacing w:after="0" w:line="276" w:lineRule="auto"/>
           </w:pPr>
           <w:hyperlink w:anchor="_Toc547562215">
             <w:r>
@@ -589,7 +589,7 @@
             <w:tabs>
               <w:tab w:val="right" w:pos="9350" w:leader="dot"/>
             </w:tabs>
-            <w:spacing w:line="276" w:lineRule="auto"/>
+            <w:spacing w:after="0" w:line="276" w:lineRule="auto"/>
             <w:ind w:left="240"/>
           </w:pPr>
           <w:hyperlink w:anchor="_Toc1309521648">
@@ -610,7 +610,7 @@
             <w:tabs>
               <w:tab w:val="right" w:pos="9350" w:leader="dot"/>
             </w:tabs>
-            <w:spacing w:line="276" w:lineRule="auto"/>
+            <w:spacing w:after="0" w:line="276" w:lineRule="auto"/>
             <w:ind w:left="240"/>
           </w:pPr>
           <w:hyperlink w:anchor="_Toc1657141647">
@@ -631,7 +631,7 @@
             <w:tabs>
               <w:tab w:val="right" w:pos="9350" w:leader="dot"/>
             </w:tabs>
-            <w:spacing w:line="276" w:lineRule="auto"/>
+            <w:spacing w:after="0" w:line="276" w:lineRule="auto"/>
             <w:ind w:left="240"/>
           </w:pPr>
           <w:hyperlink w:anchor="_Toc246716832">
@@ -652,7 +652,7 @@
             <w:tabs>
               <w:tab w:val="right" w:pos="9350" w:leader="dot"/>
             </w:tabs>
-            <w:spacing w:line="276" w:lineRule="auto"/>
+            <w:spacing w:after="0" w:line="276" w:lineRule="auto"/>
             <w:ind w:left="480"/>
           </w:pPr>
           <w:hyperlink w:anchor="_Toc74778161">
@@ -673,7 +673,7 @@
             <w:tabs>
               <w:tab w:val="right" w:pos="9350" w:leader="dot"/>
             </w:tabs>
-            <w:spacing w:line="276" w:lineRule="auto"/>
+            <w:spacing w:after="0" w:line="276" w:lineRule="auto"/>
             <w:ind w:left="480"/>
           </w:pPr>
           <w:hyperlink w:anchor="_Toc1714688765">
@@ -694,7 +694,7 @@
             <w:tabs>
               <w:tab w:val="right" w:pos="9350" w:leader="dot"/>
             </w:tabs>
-            <w:spacing w:line="276" w:lineRule="auto"/>
+            <w:spacing w:after="0" w:line="276" w:lineRule="auto"/>
             <w:ind w:left="480"/>
           </w:pPr>
           <w:hyperlink w:anchor="_Toc758451719">
@@ -715,7 +715,7 @@
             <w:tabs>
               <w:tab w:val="right" w:pos="9350" w:leader="dot"/>
             </w:tabs>
-            <w:spacing w:line="276" w:lineRule="auto"/>
+            <w:spacing w:after="0" w:line="276" w:lineRule="auto"/>
             <w:ind w:left="480"/>
           </w:pPr>
           <w:hyperlink w:anchor="_Toc1688023906">
@@ -736,7 +736,7 @@
             <w:tabs>
               <w:tab w:val="right" w:pos="9350" w:leader="dot"/>
             </w:tabs>
-            <w:spacing w:line="276" w:lineRule="auto"/>
+            <w:spacing w:after="0" w:line="276" w:lineRule="auto"/>
           </w:pPr>
           <w:hyperlink w:anchor="_Toc1781966515">
             <w:r>
@@ -756,7 +756,7 @@
             <w:tabs>
               <w:tab w:val="right" w:pos="9350" w:leader="dot"/>
             </w:tabs>
-            <w:spacing w:line="276" w:lineRule="auto"/>
+            <w:spacing w:after="0" w:line="276" w:lineRule="auto"/>
             <w:ind w:left="240"/>
           </w:pPr>
           <w:hyperlink w:anchor="_Toc533227547">
@@ -777,7 +777,7 @@
             <w:tabs>
               <w:tab w:val="right" w:pos="9350" w:leader="dot"/>
             </w:tabs>
-            <w:spacing w:line="276" w:lineRule="auto"/>
+            <w:spacing w:after="0" w:line="276" w:lineRule="auto"/>
             <w:ind w:left="240"/>
           </w:pPr>
           <w:hyperlink w:anchor="_Toc1102017531">
@@ -798,7 +798,7 @@
             <w:tabs>
               <w:tab w:val="right" w:pos="9350" w:leader="dot"/>
             </w:tabs>
-            <w:spacing w:line="276" w:lineRule="auto"/>
+            <w:spacing w:after="0" w:line="276" w:lineRule="auto"/>
             <w:ind w:left="240"/>
           </w:pPr>
           <w:hyperlink w:anchor="_Toc1334180050">
@@ -819,7 +819,7 @@
             <w:tabs>
               <w:tab w:val="right" w:pos="9350" w:leader="dot"/>
             </w:tabs>
-            <w:spacing w:line="276" w:lineRule="auto"/>
+            <w:spacing w:after="0" w:line="276" w:lineRule="auto"/>
           </w:pPr>
           <w:hyperlink w:anchor="_Toc2019915708">
             <w:r>
@@ -839,7 +839,7 @@
             <w:tabs>
               <w:tab w:val="right" w:pos="9350" w:leader="dot"/>
             </w:tabs>
-            <w:spacing w:line="276" w:lineRule="auto"/>
+            <w:spacing w:after="0" w:line="276" w:lineRule="auto"/>
             <w:ind w:left="240"/>
           </w:pPr>
           <w:hyperlink w:anchor="_Toc1344099631">
@@ -860,7 +860,7 @@
             <w:tabs>
               <w:tab w:val="right" w:pos="9350" w:leader="dot"/>
             </w:tabs>
-            <w:spacing w:line="276" w:lineRule="auto"/>
+            <w:spacing w:after="0" w:line="276" w:lineRule="auto"/>
             <w:ind w:left="240"/>
           </w:pPr>
           <w:hyperlink w:anchor="_Toc1175173068">
@@ -881,7 +881,7 @@
             <w:tabs>
               <w:tab w:val="right" w:pos="9350" w:leader="dot"/>
             </w:tabs>
-            <w:spacing w:line="276" w:lineRule="auto"/>
+            <w:spacing w:after="0" w:line="276" w:lineRule="auto"/>
           </w:pPr>
           <w:hyperlink w:anchor="_Toc2145238477">
             <w:r>
@@ -901,7 +901,7 @@
             <w:tabs>
               <w:tab w:val="right" w:pos="9350" w:leader="dot"/>
             </w:tabs>
-            <w:spacing w:line="276" w:lineRule="auto"/>
+            <w:spacing w:after="0" w:line="276" w:lineRule="auto"/>
           </w:pPr>
           <w:hyperlink w:anchor="_Toc1798998492">
             <w:r>
@@ -921,7 +921,7 @@
             <w:tabs>
               <w:tab w:val="right" w:pos="9350" w:leader="dot"/>
             </w:tabs>
-            <w:spacing w:line="276" w:lineRule="auto"/>
+            <w:spacing w:after="0" w:line="276" w:lineRule="auto"/>
             <w:ind w:left="240"/>
           </w:pPr>
           <w:hyperlink w:anchor="_Toc44621738">
@@ -942,7 +942,7 @@
             <w:tabs>
               <w:tab w:val="right" w:pos="9350" w:leader="dot"/>
             </w:tabs>
-            <w:spacing w:line="276" w:lineRule="auto"/>
+            <w:spacing w:after="0" w:line="276" w:lineRule="auto"/>
             <w:ind w:left="240"/>
           </w:pPr>
           <w:hyperlink w:anchor="_Toc1430510899">
@@ -963,7 +963,7 @@
             <w:tabs>
               <w:tab w:val="right" w:pos="9350" w:leader="dot"/>
             </w:tabs>
-            <w:spacing w:line="276" w:lineRule="auto"/>
+            <w:spacing w:after="0" w:line="276" w:lineRule="auto"/>
           </w:pPr>
           <w:hyperlink w:anchor="_Toc303816627">
             <w:r>
@@ -983,7 +983,7 @@
             <w:tabs>
               <w:tab w:val="right" w:pos="9350" w:leader="dot"/>
             </w:tabs>
-            <w:spacing w:line="276" w:lineRule="auto"/>
+            <w:spacing w:after="0" w:line="276" w:lineRule="auto"/>
             <w:ind w:left="240"/>
           </w:pPr>
           <w:hyperlink w:anchor="_Toc986397506">
@@ -1004,7 +1004,7 @@
             <w:tabs>
               <w:tab w:val="right" w:pos="9350" w:leader="dot"/>
             </w:tabs>
-            <w:spacing w:line="276" w:lineRule="auto"/>
+            <w:spacing w:after="0" w:line="276" w:lineRule="auto"/>
             <w:ind w:left="240"/>
           </w:pPr>
           <w:hyperlink w:anchor="_Toc1635594523">
@@ -1025,7 +1025,7 @@
             <w:tabs>
               <w:tab w:val="right" w:pos="9350" w:leader="dot"/>
             </w:tabs>
-            <w:spacing w:line="276" w:lineRule="auto"/>
+            <w:spacing w:after="0" w:line="276" w:lineRule="auto"/>
           </w:pPr>
           <w:hyperlink w:anchor="_Toc60363811">
             <w:r>
@@ -1045,7 +1045,7 @@
             <w:tabs>
               <w:tab w:val="right" w:pos="9350" w:leader="dot"/>
             </w:tabs>
-            <w:spacing w:line="276" w:lineRule="auto"/>
+            <w:spacing w:after="0" w:line="276" w:lineRule="auto"/>
             <w:ind w:left="240"/>
           </w:pPr>
           <w:hyperlink w:anchor="_Toc1757856986">
@@ -1066,7 +1066,7 @@
             <w:tabs>
               <w:tab w:val="right" w:pos="9350" w:leader="dot"/>
             </w:tabs>
-            <w:spacing w:line="276" w:lineRule="auto"/>
+            <w:spacing w:after="0" w:line="276" w:lineRule="auto"/>
             <w:ind w:left="240"/>
           </w:pPr>
           <w:hyperlink w:anchor="_Toc1149703421">
@@ -1087,7 +1087,7 @@
             <w:tabs>
               <w:tab w:val="right" w:pos="9350" w:leader="dot"/>
             </w:tabs>
-            <w:spacing w:line="276" w:lineRule="auto"/>
+            <w:spacing w:after="0" w:line="276" w:lineRule="auto"/>
             <w:ind w:left="240"/>
           </w:pPr>
           <w:hyperlink w:anchor="_Toc838305422">
@@ -1108,7 +1108,7 @@
             <w:tabs>
               <w:tab w:val="right" w:pos="9350" w:leader="dot"/>
             </w:tabs>
-            <w:spacing w:line="276" w:lineRule="auto"/>
+            <w:spacing w:after="0" w:line="276" w:lineRule="auto"/>
           </w:pPr>
           <w:hyperlink w:anchor="_Toc555551067">
             <w:r>
@@ -1128,7 +1128,7 @@
             <w:tabs>
               <w:tab w:val="right" w:pos="9350" w:leader="dot"/>
             </w:tabs>
-            <w:spacing w:line="276" w:lineRule="auto"/>
+            <w:spacing w:after="0" w:line="276" w:lineRule="auto"/>
             <w:ind w:left="240"/>
           </w:pPr>
           <w:hyperlink w:anchor="_Toc1528646011">
@@ -1149,7 +1149,7 @@
             <w:tabs>
               <w:tab w:val="right" w:pos="9350" w:leader="dot"/>
             </w:tabs>
-            <w:spacing w:line="276" w:lineRule="auto"/>
+            <w:spacing w:after="0" w:line="276" w:lineRule="auto"/>
             <w:ind w:left="240"/>
           </w:pPr>
           <w:hyperlink w:anchor="_Toc686287178">
@@ -1170,7 +1170,7 @@
             <w:tabs>
               <w:tab w:val="right" w:pos="9350" w:leader="dot"/>
             </w:tabs>
-            <w:spacing w:line="276" w:lineRule="auto"/>
+            <w:spacing w:after="0" w:line="276" w:lineRule="auto"/>
             <w:ind w:left="240"/>
           </w:pPr>
           <w:hyperlink w:anchor="_Toc1893000695">
@@ -1191,7 +1191,7 @@
             <w:tabs>
               <w:tab w:val="right" w:pos="9350" w:leader="dot"/>
             </w:tabs>
-            <w:spacing w:line="276" w:lineRule="auto"/>
+            <w:spacing w:after="0" w:line="276" w:lineRule="auto"/>
           </w:pPr>
           <w:hyperlink w:anchor="_Toc883591741">
             <w:r>
@@ -1211,7 +1211,7 @@
             <w:tabs>
               <w:tab w:val="right" w:pos="9350" w:leader="dot"/>
             </w:tabs>
-            <w:spacing w:line="276" w:lineRule="auto"/>
+            <w:spacing w:after="0" w:line="276" w:lineRule="auto"/>
             <w:ind w:left="240"/>
           </w:pPr>
           <w:hyperlink w:anchor="_Toc944855213">
@@ -1232,7 +1232,7 @@
             <w:tabs>
               <w:tab w:val="right" w:pos="9350" w:leader="dot"/>
             </w:tabs>
-            <w:spacing w:line="276" w:lineRule="auto"/>
+            <w:spacing w:after="0" w:line="276" w:lineRule="auto"/>
             <w:ind w:left="240"/>
           </w:pPr>
           <w:hyperlink w:anchor="_Toc1875706211">
@@ -1253,7 +1253,7 @@
             <w:tabs>
               <w:tab w:val="right" w:pos="9350" w:leader="dot"/>
             </w:tabs>
-            <w:spacing w:line="276" w:lineRule="auto"/>
+            <w:spacing w:after="0" w:line="276" w:lineRule="auto"/>
             <w:ind w:left="240"/>
           </w:pPr>
           <w:hyperlink w:anchor="_Toc1433350481">
@@ -1274,7 +1274,7 @@
             <w:tabs>
               <w:tab w:val="right" w:pos="9350" w:leader="dot"/>
             </w:tabs>
-            <w:spacing w:line="276" w:lineRule="auto"/>
+            <w:spacing w:after="0" w:line="276" w:lineRule="auto"/>
             <w:ind w:left="240"/>
           </w:pPr>
           <w:hyperlink w:anchor="_Toc2065087918">
@@ -1295,7 +1295,7 @@
             <w:tabs>
               <w:tab w:val="right" w:pos="9350" w:leader="dot"/>
             </w:tabs>
-            <w:spacing w:line="276" w:lineRule="auto"/>
+            <w:spacing w:after="0" w:line="276" w:lineRule="auto"/>
           </w:pPr>
           <w:hyperlink w:anchor="_Toc1382144159">
             <w:r>
@@ -1315,7 +1315,7 @@
             <w:tabs>
               <w:tab w:val="right" w:pos="9350" w:leader="dot"/>
             </w:tabs>
-            <w:spacing w:line="276" w:lineRule="auto"/>
+            <w:spacing w:after="0" w:line="276" w:lineRule="auto"/>
           </w:pPr>
           <w:hyperlink w:anchor="_Toc422408538">
             <w:r>
@@ -1335,7 +1335,7 @@
             <w:tabs>
               <w:tab w:val="right" w:pos="9350" w:leader="dot"/>
             </w:tabs>
-            <w:spacing w:line="276" w:lineRule="auto"/>
+            <w:spacing w:after="0" w:line="276" w:lineRule="auto"/>
           </w:pPr>
           <w:hyperlink w:anchor="_Toc1714908650">
             <w:r>
@@ -1355,7 +1355,7 @@
             <w:tabs>
               <w:tab w:val="right" w:pos="9350" w:leader="dot"/>
             </w:tabs>
-            <w:spacing w:line="276" w:lineRule="auto"/>
+            <w:spacing w:after="0" w:line="276" w:lineRule="auto"/>
           </w:pPr>
           <w:hyperlink w:anchor="_Toc602910037">
             <w:r>
@@ -1375,7 +1375,7 @@
             <w:tabs>
               <w:tab w:val="right" w:pos="9350" w:leader="dot"/>
             </w:tabs>
-            <w:spacing w:line="276" w:lineRule="auto"/>
+            <w:spacing w:after="0" w:line="276" w:lineRule="auto"/>
           </w:pPr>
           <w:hyperlink w:anchor="_Toc338438315">
             <w:r>
@@ -1395,7 +1395,7 @@
             <w:tabs>
               <w:tab w:val="right" w:pos="9350" w:leader="dot"/>
             </w:tabs>
-            <w:spacing w:line="276" w:lineRule="auto"/>
+            <w:spacing w:after="0" w:line="276" w:lineRule="auto"/>
           </w:pPr>
           <w:hyperlink w:anchor="_Toc423340725">
             <w:r>
@@ -1415,7 +1415,7 @@
             <w:tabs>
               <w:tab w:val="right" w:pos="9350" w:leader="dot"/>
             </w:tabs>
-            <w:spacing w:line="276" w:lineRule="auto"/>
+            <w:spacing w:after="0" w:line="276" w:lineRule="auto"/>
             <w:ind w:left="240"/>
           </w:pPr>
           <w:hyperlink w:anchor="_Toc155960099">
@@ -1436,7 +1436,7 @@
             <w:tabs>
               <w:tab w:val="right" w:pos="9350" w:leader="dot"/>
             </w:tabs>
-            <w:spacing w:line="276" w:lineRule="auto"/>
+            <w:spacing w:after="0" w:line="276" w:lineRule="auto"/>
             <w:ind w:left="240"/>
           </w:pPr>
           <w:hyperlink w:anchor="_Toc1139321417">
@@ -1457,7 +1457,7 @@
             <w:tabs>
               <w:tab w:val="right" w:pos="9350" w:leader="dot"/>
             </w:tabs>
-            <w:spacing w:line="276" w:lineRule="auto"/>
+            <w:spacing w:after="0" w:line="276" w:lineRule="auto"/>
             <w:ind w:left="240"/>
           </w:pPr>
           <w:hyperlink w:anchor="_Toc87704262">
@@ -1478,7 +1478,7 @@
             <w:tabs>
               <w:tab w:val="right" w:pos="9350" w:leader="dot"/>
             </w:tabs>
-            <w:spacing w:line="276" w:lineRule="auto"/>
+            <w:spacing w:after="0" w:line="276" w:lineRule="auto"/>
             <w:ind w:left="240"/>
           </w:pPr>
           <w:hyperlink w:anchor="_Toc510997148">
@@ -1499,7 +1499,7 @@
             <w:tabs>
               <w:tab w:val="right" w:pos="9350" w:leader="dot"/>
             </w:tabs>
-            <w:spacing w:line="276" w:lineRule="auto"/>
+            <w:spacing w:after="0" w:line="276" w:lineRule="auto"/>
             <w:ind w:left="240"/>
           </w:pPr>
           <w:hyperlink w:anchor="_Toc274667010">
@@ -1520,7 +1520,7 @@
             <w:tabs>
               <w:tab w:val="right" w:pos="9350" w:leader="dot"/>
             </w:tabs>
-            <w:spacing w:line="276" w:lineRule="auto"/>
+            <w:spacing w:after="0" w:line="276" w:lineRule="auto"/>
           </w:pPr>
           <w:hyperlink w:anchor="_Toc1151390629">
             <w:r>
@@ -1540,7 +1540,7 @@
             <w:tabs>
               <w:tab w:val="right" w:pos="9350" w:leader="dot"/>
             </w:tabs>
-            <w:spacing w:line="276" w:lineRule="auto"/>
+            <w:spacing w:after="0" w:line="276" w:lineRule="auto"/>
           </w:pPr>
           <w:hyperlink w:anchor="_Toc897270913">
             <w:r>
@@ -1560,7 +1560,7 @@
             <w:tabs>
               <w:tab w:val="right" w:pos="9350" w:leader="dot"/>
             </w:tabs>
-            <w:spacing w:line="276" w:lineRule="auto"/>
+            <w:spacing w:after="0" w:line="276" w:lineRule="auto"/>
           </w:pPr>
           <w:hyperlink w:anchor="_Toc444812861">
             <w:r>
@@ -1580,7 +1580,7 @@
             <w:tabs>
               <w:tab w:val="right" w:pos="9350" w:leader="dot"/>
             </w:tabs>
-            <w:spacing w:line="276" w:lineRule="auto"/>
+            <w:spacing w:after="0" w:line="276" w:lineRule="auto"/>
           </w:pPr>
           <w:hyperlink w:anchor="_Toc456173874">
             <w:r>
@@ -2770,6 +2770,7 @@
           </w:tcPr>
           <w:p>
             <w:pPr>
+              <w:spacing w:after="0"/>
               <w:jc w:val="center"/>
             </w:pPr>
             <w:r>
@@ -2802,6 +2803,7 @@
           </w:tcPr>
           <w:p>
             <w:pPr>
+              <w:spacing w:after="0"/>
               <w:jc w:val="center"/>
             </w:pPr>
             <w:r>
@@ -2834,6 +2836,7 @@
           </w:tcPr>
           <w:p>
             <w:pPr>
+              <w:spacing w:after="0"/>
               <w:jc w:val="center"/>
             </w:pPr>
             <w:r>
@@ -2866,6 +2869,7 @@
           </w:tcPr>
           <w:p>
             <w:pPr>
+              <w:spacing w:after="0"/>
               <w:jc w:val="center"/>
             </w:pPr>
             <w:r>
@@ -2899,6 +2903,7 @@
           </w:tcPr>
           <w:p>
             <w:pPr>
+              <w:spacing w:after="0"/>
               <w:jc w:val="center"/>
             </w:pPr>
             <w:r>
@@ -2930,6 +2935,7 @@
           </w:tcPr>
           <w:p>
             <w:pPr>
+              <w:spacing w:after="0"/>
               <w:jc w:val="left"/>
             </w:pPr>
             <w:r>
@@ -2961,6 +2967,7 @@
           </w:tcPr>
           <w:p>
             <w:pPr>
+              <w:spacing w:after="0"/>
               <w:jc w:val="left"/>
             </w:pPr>
             <w:r>
@@ -2992,6 +2999,7 @@
           </w:tcPr>
           <w:p>
             <w:pPr>
+              <w:spacing w:after="0"/>
               <w:jc w:val="left"/>
             </w:pPr>
             <w:r>
@@ -3025,6 +3033,7 @@
           </w:tcPr>
           <w:p>
             <w:pPr>
+              <w:spacing w:after="0"/>
               <w:jc w:val="center"/>
             </w:pPr>
             <w:r>
@@ -3056,6 +3065,7 @@
           </w:tcPr>
           <w:p>
             <w:pPr>
+              <w:spacing w:after="0"/>
               <w:jc w:val="left"/>
             </w:pPr>
             <w:r>
@@ -3087,6 +3097,7 @@
           </w:tcPr>
           <w:p>
             <w:pPr>
+              <w:spacing w:after="0"/>
               <w:jc w:val="left"/>
             </w:pPr>
             <w:r>
@@ -3118,6 +3129,7 @@
           </w:tcPr>
           <w:p>
             <w:pPr>
+              <w:spacing w:after="0"/>
               <w:jc w:val="left"/>
             </w:pPr>
             <w:r>
@@ -3151,6 +3163,7 @@
           </w:tcPr>
           <w:p>
             <w:pPr>
+              <w:spacing w:after="0"/>
               <w:jc w:val="center"/>
             </w:pPr>
             <w:r>
@@ -3182,6 +3195,7 @@
           </w:tcPr>
           <w:p>
             <w:pPr>
+              <w:spacing w:after="0"/>
               <w:jc w:val="left"/>
             </w:pPr>
             <w:r>
@@ -3213,6 +3227,7 @@
           </w:tcPr>
           <w:p>
             <w:pPr>
+              <w:spacing w:after="0"/>
               <w:jc w:val="left"/>
             </w:pPr>
             <w:r>
@@ -3244,6 +3259,7 @@
           </w:tcPr>
           <w:p>
             <w:pPr>
+              <w:spacing w:after="0"/>
               <w:jc w:val="left"/>
             </w:pPr>
             <w:r>
@@ -3277,6 +3293,7 @@
           </w:tcPr>
           <w:p>
             <w:pPr>
+              <w:spacing w:after="0"/>
               <w:jc w:val="center"/>
             </w:pPr>
             <w:r>
@@ -3308,6 +3325,7 @@
           </w:tcPr>
           <w:p>
             <w:pPr>
+              <w:spacing w:after="0"/>
               <w:jc w:val="left"/>
             </w:pPr>
             <w:r>
@@ -3339,6 +3357,7 @@
           </w:tcPr>
           <w:p>
             <w:pPr>
+              <w:spacing w:after="0"/>
               <w:jc w:val="left"/>
             </w:pPr>
             <w:r>
@@ -3370,6 +3389,7 @@
           </w:tcPr>
           <w:p>
             <w:pPr>
+              <w:spacing w:after="0"/>
               <w:jc w:val="left"/>
             </w:pPr>
             <w:r>
@@ -3437,6 +3457,7 @@
           </w:tcPr>
           <w:p>
             <w:pPr>
+              <w:spacing w:after="0"/>
               <w:jc w:val="center"/>
             </w:pPr>
             <w:r>
@@ -3471,6 +3492,9 @@
             </w:tcMar>
           </w:tcPr>
           <w:p>
+            <w:pPr>
+              <w:spacing w:after="0"/>
+            </w:pPr>
             <w:r>
               <w:rPr>
                 <w:b/>
@@ -3498,6 +3522,9 @@
             </w:tcMar>
           </w:tcPr>
           <w:p>
+            <w:pPr>
+              <w:spacing w:after="0"/>
+            </w:pPr>
             <w:r>
               <w:rPr>
                 <w:b/>
@@ -3525,6 +3552,9 @@
             </w:tcMar>
           </w:tcPr>
           <w:p>
+            <w:pPr>
+              <w:spacing w:after="0"/>
+            </w:pPr>
             <w:r>
               <w:rPr>
                 <w:b/>
@@ -3555,6 +3585,9 @@
             <w:vAlign w:val="center"/>
           </w:tcPr>
           <w:p>
+            <w:pPr>
+              <w:spacing w:after="0"/>
+            </w:pPr>
             <w:r>
               <w:rPr>
                 <w:b/>
@@ -3581,6 +3614,9 @@
             </w:tcMar>
           </w:tcPr>
           <w:p>
+            <w:pPr>
+              <w:spacing w:after="0"/>
+            </w:pPr>
             <w:r>
               <w:t xml:space="preserve">$1.2M</w:t>
             </w:r>
@@ -3603,6 +3639,9 @@
             </w:tcMar>
           </w:tcPr>
           <w:p>
+            <w:pPr>
+              <w:spacing w:after="0"/>
+            </w:pPr>
             <w:r>
               <w:t xml:space="preserve">$1.5M</w:t>
             </w:r>
@@ -3620,7 +3659,11 @@
               <w:right w:val="single" w:color="999999" w:sz="1"/>
             </w:tcBorders>
           </w:tcPr>
-          <w:p/>
+          <w:p>
+            <w:pPr>
+              <w:spacing w:after="0"/>
+            </w:pPr>
+          </w:p>
         </w:tc>
         <w:tc>
           <w:tcPr>
@@ -3639,6 +3682,9 @@
             </w:tcMar>
           </w:tcPr>
           <w:p>
+            <w:pPr>
+              <w:spacing w:after="0"/>
+            </w:pPr>
             <w:r>
               <w:t xml:space="preserve">+12%</w:t>
             </w:r>
@@ -3661,6 +3707,9 @@
             </w:tcMar>
           </w:tcPr>
           <w:p>
+            <w:pPr>
+              <w:spacing w:after="0"/>
+            </w:pPr>
             <w:r>
               <w:t xml:space="preserve">+25%</w:t>
             </w:r>
@@ -3717,6 +3766,9 @@
             </w:tcMar>
           </w:tcPr>
           <w:p>
+            <w:pPr>
+              <w:spacing w:after="0"/>
+            </w:pPr>
             <w:r>
               <w:rPr>
                 <w:b/>
@@ -3743,6 +3795,9 @@
             </w:tcMar>
           </w:tcPr>
           <w:p>
+            <w:pPr>
+              <w:spacing w:after="0"/>
+            </w:pPr>
             <w:r>
               <w:t xml:space="preserve">Dotted green + dashed left</w:t>
             </w:r>
@@ -3768,6 +3823,9 @@
             </w:tcMar>
           </w:tcPr>
           <w:p>
+            <w:pPr>
+              <w:spacing w:after="0"/>
+            </w:pPr>
             <w:r>
               <w:t xml:space="preserve">Partial borders + yellow shading</w:t>
             </w:r>
@@ -3791,6 +3849,9 @@
             </w:tcMar>
           </w:tcPr>
           <w:p>
+            <w:pPr>
+              <w:spacing w:after="0"/>
+            </w:pPr>
             <w:r>
               <w:t xml:space="preserve">Triple purple bottom + green</w:t>
             </w:r>
@@ -3868,6 +3929,9 @@
             </w:tcMar>
           </w:tcPr>
           <w:p>
+            <w:pPr>
+              <w:spacing w:after="0"/>
+            </w:pPr>
             <w:r>
               <w:rPr>
                 <w:b/>
@@ -3896,6 +3960,9 @@
             </w:tcMar>
           </w:tcPr>
           <w:p>
+            <w:pPr>
+              <w:spacing w:after="0"/>
+            </w:pPr>
             <w:r>
               <w:rPr>
                 <w:b/>
@@ -3973,6 +4040,7 @@
                 </w:tcPr>
                 <w:p>
                   <w:pPr>
+                    <w:spacing w:after="0"/>
                     <w:jc w:val="center"/>
                   </w:pPr>
                   <w:r>
@@ -4005,6 +4073,7 @@
                 </w:tcPr>
                 <w:p>
                   <w:pPr>
+                    <w:spacing w:after="0"/>
                     <w:jc w:val="center"/>
                   </w:pPr>
                   <w:r>
@@ -4037,6 +4106,7 @@
                 </w:tcPr>
                 <w:p>
                   <w:pPr>
+                    <w:spacing w:after="0"/>
                     <w:jc w:val="center"/>
                   </w:pPr>
                   <w:r>
@@ -4070,6 +4140,7 @@
                 </w:tcPr>
                 <w:p>
                   <w:pPr>
+                    <w:spacing w:after="0"/>
                     <w:jc w:val="center"/>
                   </w:pPr>
                   <w:r>
@@ -4099,6 +4170,7 @@
                 </w:tcPr>
                 <w:p>
                   <w:pPr>
+                    <w:spacing w:after="0"/>
                     <w:jc w:val="center"/>
                   </w:pPr>
                   <w:r>
@@ -4128,6 +4200,7 @@
                 </w:tcPr>
                 <w:p>
                   <w:pPr>
+                    <w:spacing w:after="0"/>
                     <w:jc w:val="center"/>
                   </w:pPr>
                   <w:r>
@@ -4159,6 +4232,7 @@
                 </w:tcPr>
                 <w:p>
                   <w:pPr>
+                    <w:spacing w:after="0"/>
                     <w:jc w:val="center"/>
                   </w:pPr>
                   <w:r>
@@ -4188,6 +4262,7 @@
                 </w:tcPr>
                 <w:p>
                   <w:pPr>
+                    <w:spacing w:after="0"/>
                     <w:jc w:val="center"/>
                   </w:pPr>
                   <w:r>
@@ -4217,6 +4292,7 @@
                 </w:tcPr>
                 <w:p>
                   <w:pPr>
+                    <w:spacing w:after="0"/>
                     <w:jc w:val="center"/>
                   </w:pPr>
                   <w:r>
@@ -4248,6 +4324,7 @@
                 </w:tcPr>
                 <w:p>
                   <w:pPr>
+                    <w:spacing w:after="0"/>
                     <w:jc w:val="center"/>
                   </w:pPr>
                   <w:r>
@@ -4277,6 +4354,7 @@
                 </w:tcPr>
                 <w:p>
                   <w:pPr>
+                    <w:spacing w:after="0"/>
                     <w:jc w:val="center"/>
                   </w:pPr>
                   <w:r>
@@ -4306,6 +4384,7 @@
                 </w:tcPr>
                 <w:p>
                   <w:pPr>
+                    <w:spacing w:after="0"/>
                     <w:jc w:val="center"/>
                   </w:pPr>
                   <w:r>
@@ -4321,7 +4400,7 @@
           </w:tbl>
           <w:p>
             <w:pPr>
-              <w:spacing w:before="80"/>
+              <w:spacing w:after="0" w:before="80"/>
             </w:pPr>
             <w:r>
               <w:rPr>
@@ -4349,6 +4428,9 @@
             </w:tcMar>
           </w:tcPr>
           <w:p>
+            <w:pPr>
+              <w:spacing w:after="0"/>
+            </w:pPr>
             <w:r>
               <w:rPr>
                 <w:b/>
@@ -4364,6 +4446,7 @@
                 <w:ilvl w:val="0"/>
                 <w:numId w:val="2"/>
               </w:numPr>
+              <w:spacing w:after="0"/>
             </w:pPr>
             <w:r>
               <w:t xml:space="preserve">Item Alpha</w:t>
@@ -4376,6 +4459,7 @@
                 <w:ilvl w:val="0"/>
                 <w:numId w:val="2"/>
               </w:numPr>
+              <w:spacing w:after="0"/>
             </w:pPr>
             <w:r>
               <w:t xml:space="preserve">Item Beta</w:t>
@@ -4388,6 +4472,7 @@
                 <w:ilvl w:val="0"/>
                 <w:numId w:val="2"/>
               </w:numPr>
+              <w:spacing w:after="0"/>
             </w:pPr>
             <w:r>
               <w:t xml:space="preserve">Item Gamma</w:t>
@@ -4395,7 +4480,7 @@
           </w:p>
           <w:p>
             <w:pPr>
-              <w:spacing w:before="80"/>
+              <w:spacing w:after="0" w:before="80"/>
             </w:pPr>
             <w:r>
               <w:rPr>
@@ -4435,7 +4520,7 @@
           </w:p>
           <w:p>
             <w:pPr>
-              <w:spacing w:before="80"/>
+              <w:spacing w:after="0" w:before="80"/>
             </w:pPr>
             <w:r>
               <w:t xml:space="preserve">Image: </w:t>
@@ -4532,6 +4617,9 @@
             </w:tcMar>
           </w:tcPr>
           <w:p>
+            <w:pPr>
+              <w:spacing w:after="0"/>
+            </w:pPr>
             <w:r>
               <w:rPr>
                 <w:b/>
@@ -4577,6 +4665,9 @@
                   </w:tcMar>
                 </w:tcPr>
                 <w:p>
+                  <w:pPr>
+                    <w:spacing w:after="0"/>
+                  </w:pPr>
                   <w:r>
                     <w:rPr>
                       <w:b/>
@@ -4623,6 +4714,9 @@
                         </w:tcMar>
                       </w:tcPr>
                       <w:p>
+                        <w:pPr>
+                          <w:spacing w:after="0"/>
+                        </w:pPr>
                         <w:r>
                           <w:rPr>
                             <w:b/>
@@ -4653,6 +4747,9 @@
                         </w:tcMar>
                       </w:tcPr>
                       <w:p>
+                        <w:pPr>
+                          <w:spacing w:after="0"/>
+                        </w:pPr>
                         <w:r>
                           <w:rPr>
                             <w:b/>
@@ -4667,11 +4764,19 @@
                     </w:tc>
                   </w:tr>
                 </w:tbl>
-                <w:p/>
+                <w:p>
+                  <w:pPr>
+                    <w:spacing w:after="0"/>
+                  </w:pPr>
+                </w:p>
               </w:tc>
             </w:tr>
           </w:tbl>
-          <w:p/>
+          <w:p>
+            <w:pPr>
+              <w:spacing w:after="0"/>
+            </w:pPr>
+          </w:p>
         </w:tc>
       </w:tr>
     </w:tbl>
@@ -5626,6 +5731,9 @@
             <w:vAlign w:val="center"/>
           </w:tcPr>
           <w:p>
+            <w:pPr>
+              <w:spacing w:after="0"/>
+            </w:pPr>
             <w:r>
               <w:rPr>
                 <w:b/>
@@ -5653,6 +5761,9 @@
             <w:vAlign w:val="center"/>
           </w:tcPr>
           <w:p>
+            <w:pPr>
+              <w:spacing w:after="0"/>
+            </w:pPr>
             <w:r>
               <w:rPr>
                 <w:color w:val="AAAAAA"/>
@@ -5682,6 +5793,9 @@
             <w:vAlign w:val="center"/>
           </w:tcPr>
           <w:p>
+            <w:pPr>
+              <w:spacing w:after="0"/>
+            </w:pPr>
             <w:r>
               <w:rPr>
                 <w:b/>
@@ -5709,6 +5823,9 @@
             <w:vAlign w:val="center"/>
           </w:tcPr>
           <w:p>
+            <w:pPr>
+              <w:spacing w:after="0"/>
+            </w:pPr>
             <w:r>
               <w:rPr>
                 <w:color w:val="AAAAAA"/>
@@ -5738,6 +5855,9 @@
             <w:vAlign w:val="center"/>
           </w:tcPr>
           <w:p>
+            <w:pPr>
+              <w:spacing w:after="0"/>
+            </w:pPr>
             <w:r>
               <w:rPr>
                 <w:b/>
@@ -5765,6 +5885,9 @@
             <w:vAlign w:val="center"/>
           </w:tcPr>
           <w:p>
+            <w:pPr>
+              <w:spacing w:after="0"/>
+            </w:pPr>
             <w:r>
               <w:rPr>
                 <w:color w:val="AAAAAA"/>
@@ -5794,6 +5917,9 @@
             <w:vAlign w:val="center"/>
           </w:tcPr>
           <w:p>
+            <w:pPr>
+              <w:spacing w:after="0"/>
+            </w:pPr>
             <w:r>
               <w:rPr>
                 <w:b/>
@@ -5821,6 +5947,9 @@
             <w:vAlign w:val="center"/>
           </w:tcPr>
           <w:p>
+            <w:pPr>
+              <w:spacing w:after="0"/>
+            </w:pPr>
             <w:r>
               <w:rPr>
                 <w:color w:val="AAAAAA"/>
@@ -5850,6 +5979,9 @@
             <w:vAlign w:val="center"/>
           </w:tcPr>
           <w:p>
+            <w:pPr>
+              <w:spacing w:after="0"/>
+            </w:pPr>
             <w:r>
               <w:rPr>
                 <w:b/>
@@ -5877,6 +6009,9 @@
             <w:vAlign w:val="center"/>
           </w:tcPr>
           <w:p>
+            <w:pPr>
+              <w:spacing w:after="0"/>
+            </w:pPr>
             <w:r>
               <w:rPr>
                 <w:color w:val="AAAAAA"/>
@@ -5906,6 +6041,9 @@
             <w:vAlign w:val="center"/>
           </w:tcPr>
           <w:p>
+            <w:pPr>
+              <w:spacing w:after="0"/>
+            </w:pPr>
             <w:r>
               <w:rPr>
                 <w:b/>
@@ -5933,6 +6071,9 @@
             <w:vAlign w:val="center"/>
           </w:tcPr>
           <w:p>
+            <w:pPr>
+              <w:spacing w:after="0"/>
+            </w:pPr>
             <w:r>
               <w:rPr>
                 <w:color w:val="AAAAAA"/>
@@ -5962,6 +6103,9 @@
             <w:vAlign w:val="center"/>
           </w:tcPr>
           <w:p>
+            <w:pPr>
+              <w:spacing w:after="0"/>
+            </w:pPr>
             <w:r>
               <w:rPr>
                 <w:b/>
@@ -5989,6 +6133,9 @@
             <w:vAlign w:val="center"/>
           </w:tcPr>
           <w:p>
+            <w:pPr>
+              <w:spacing w:after="0"/>
+            </w:pPr>
             <w:r>
               <w:rPr>
                 <w:color w:val="AAAAAA"/>
@@ -6470,6 +6617,7 @@
           </w:tcPr>
           <w:p>
             <w:pPr>
+              <w:spacing w:after="0"/>
               <w:jc w:val="center"/>
             </w:pPr>
             <w:r>
@@ -6501,6 +6649,7 @@
           </w:tcPr>
           <w:p>
             <w:pPr>
+              <w:spacing w:after="0"/>
               <w:jc w:val="center"/>
             </w:pPr>
             <w:r>
@@ -6534,6 +6683,7 @@
           </w:tcPr>
           <w:p>
             <w:pPr>
+              <w:spacing w:after="0"/>
               <w:jc w:val="center"/>
             </w:pPr>
             <w:r>
@@ -6560,6 +6710,7 @@
           </w:tcPr>
           <w:p>
             <w:pPr>
+              <w:spacing w:after="0"/>
               <w:jc w:val="center"/>
             </w:pPr>
             <w:r>
@@ -6588,6 +6739,7 @@
           </w:tcPr>
           <w:p>
             <w:pPr>
+              <w:spacing w:after="0"/>
               <w:jc w:val="center"/>
             </w:pPr>
             <w:r>
@@ -6614,6 +6766,7 @@
           </w:tcPr>
           <w:p>
             <w:pPr>
+              <w:spacing w:after="0"/>
               <w:jc w:val="center"/>
             </w:pPr>
             <w:r>
@@ -6642,6 +6795,7 @@
           </w:tcPr>
           <w:p>
             <w:pPr>
+              <w:spacing w:after="0"/>
               <w:jc w:val="center"/>
             </w:pPr>
             <w:r>
@@ -6668,6 +6822,7 @@
           </w:tcPr>
           <w:p>
             <w:pPr>
+              <w:spacing w:after="0"/>
               <w:jc w:val="center"/>
             </w:pPr>
             <w:r>
@@ -7085,6 +7240,7 @@
           </w:tcPr>
           <w:p>
             <w:pPr>
+              <w:spacing w:after="0"/>
               <w:jc w:val="center"/>
             </w:pPr>
             <w:r>
@@ -7130,6 +7286,7 @@
           </w:p>
           <w:p>
             <w:pPr>
+              <w:spacing w:after="0"/>
               <w:jc w:val="center"/>
             </w:pPr>
             <w:r>
@@ -7161,6 +7318,7 @@
           </w:tcPr>
           <w:p>
             <w:pPr>
+              <w:spacing w:after="0"/>
               <w:jc w:val="center"/>
             </w:pPr>
             <w:r>
@@ -7206,6 +7364,7 @@
           </w:p>
           <w:p>
             <w:pPr>
+              <w:spacing w:after="0"/>
               <w:jc w:val="center"/>
             </w:pPr>
             <w:r>
@@ -7237,6 +7396,7 @@
           </w:tcPr>
           <w:p>
             <w:pPr>
+              <w:spacing w:after="0"/>
               <w:jc w:val="center"/>
             </w:pPr>
             <w:r>
@@ -7282,6 +7442,7 @@
           </w:p>
           <w:p>
             <w:pPr>
+              <w:spacing w:after="0"/>
               <w:jc w:val="center"/>
             </w:pPr>
             <w:r>
@@ -7313,6 +7474,7 @@
           </w:tcPr>
           <w:p>
             <w:pPr>
+              <w:spacing w:after="0"/>
               <w:jc w:val="center"/>
             </w:pPr>
             <w:r>
@@ -7358,6 +7520,7 @@
           </w:p>
           <w:p>
             <w:pPr>
+              <w:spacing w:after="0"/>
               <w:jc w:val="center"/>
             </w:pPr>
             <w:r>
@@ -7418,6 +7581,9 @@
             </w:tcMar>
           </w:tcPr>
           <w:p>
+            <w:pPr>
+              <w:spacing w:after="0"/>
+            </w:pPr>
             <w:r>
               <w:rPr>
                 <w:b/>
@@ -7444,6 +7610,9 @@
             </w:tcMar>
           </w:tcPr>
           <w:p>
+            <w:pPr>
+              <w:spacing w:after="0"/>
+            </w:pPr>
             <w:r>
               <w:rPr>
                 <w:b/>
@@ -7470,6 +7639,9 @@
             </w:tcMar>
           </w:tcPr>
           <w:p>
+            <w:pPr>
+              <w:spacing w:after="0"/>
+            </w:pPr>
             <w:r>
               <w:rPr>
                 <w:b/>
@@ -7498,6 +7670,9 @@
             </w:tcMar>
           </w:tcPr>
           <w:p>
+            <w:pPr>
+              <w:spacing w:after="0"/>
+            </w:pPr>
             <w:r>
               <w:t xml:space="preserve">Data A1</w:t>
             </w:r>
@@ -7520,6 +7695,9 @@
             </w:tcMar>
           </w:tcPr>
           <w:p>
+            <w:pPr>
+              <w:spacing w:after="0"/>
+            </w:pPr>
             <w:r>
               <w:t xml:space="preserve">Data B1</w:t>
             </w:r>
@@ -7542,6 +7720,9 @@
             </w:tcMar>
           </w:tcPr>
           <w:p>
+            <w:pPr>
+              <w:spacing w:after="0"/>
+            </w:pPr>
             <w:r>
               <w:t xml:space="preserve">Data C1</w:t>
             </w:r>
@@ -7566,6 +7747,9 @@
             </w:tcMar>
           </w:tcPr>
           <w:p>
+            <w:pPr>
+              <w:spacing w:after="0"/>
+            </w:pPr>
             <w:r>
               <w:t xml:space="preserve">Data A2</w:t>
             </w:r>
@@ -7588,6 +7772,9 @@
             </w:tcMar>
           </w:tcPr>
           <w:p>
+            <w:pPr>
+              <w:spacing w:after="0"/>
+            </w:pPr>
             <w:r>
               <w:t xml:space="preserve">Data B2</w:t>
             </w:r>
@@ -7610,6 +7797,9 @@
             </w:tcMar>
           </w:tcPr>
           <w:p>
+            <w:pPr>
+              <w:spacing w:after="0"/>
+            </w:pPr>
             <w:r>
               <w:t xml:space="preserve">Data C2</w:t>
             </w:r>
@@ -7792,6 +7982,7 @@
           </w:tcPr>
           <w:p>
             <w:pPr>
+              <w:spacing w:after="0"/>
               <w:jc w:val="center"/>
             </w:pPr>
             <w:r>
@@ -7825,6 +8016,7 @@
           </w:tcPr>
           <w:p>
             <w:pPr>
+              <w:spacing w:after="0"/>
               <w:jc w:val="center"/>
             </w:pPr>
             <w:r>
@@ -7858,6 +8050,7 @@
           </w:tcPr>
           <w:p>
             <w:pPr>
+              <w:spacing w:after="0"/>
               <w:jc w:val="center"/>
             </w:pPr>
             <w:r>
@@ -7891,6 +8084,7 @@
           </w:tcPr>
           <w:p>
             <w:pPr>
+              <w:spacing w:after="0"/>
               <w:jc w:val="center"/>
             </w:pPr>
             <w:r>
@@ -7924,6 +8118,7 @@
           </w:tcPr>
           <w:p>
             <w:pPr>
+              <w:spacing w:after="0"/>
               <w:jc w:val="center"/>
             </w:pPr>
             <w:r>
@@ -7957,6 +8152,7 @@
           </w:tcPr>
           <w:p>
             <w:pPr>
+              <w:spacing w:after="0"/>
               <w:jc w:val="center"/>
             </w:pPr>
             <w:r>
@@ -7990,6 +8186,7 @@
           </w:tcPr>
           <w:p>
             <w:pPr>
+              <w:spacing w:after="0"/>
               <w:jc w:val="center"/>
             </w:pPr>
             <w:r>
@@ -8023,6 +8220,7 @@
           </w:tcPr>
           <w:p>
             <w:pPr>
+              <w:spacing w:after="0"/>
               <w:jc w:val="center"/>
             </w:pPr>
             <w:r>
@@ -8058,6 +8256,7 @@
           </w:tcPr>
           <w:p>
             <w:pPr>
+              <w:spacing w:after="0"/>
               <w:jc w:val="center"/>
             </w:pPr>
             <w:r>
@@ -8088,6 +8287,7 @@
           </w:tcPr>
           <w:p>
             <w:pPr>
+              <w:spacing w:after="0"/>
               <w:jc w:val="center"/>
             </w:pPr>
             <w:r>
@@ -8118,6 +8318,7 @@
           </w:tcPr>
           <w:p>
             <w:pPr>
+              <w:spacing w:after="0"/>
               <w:jc w:val="center"/>
             </w:pPr>
             <w:r>
@@ -8148,6 +8349,7 @@
           </w:tcPr>
           <w:p>
             <w:pPr>
+              <w:spacing w:after="0"/>
               <w:jc w:val="center"/>
             </w:pPr>
             <w:r>
@@ -8178,6 +8380,7 @@
           </w:tcPr>
           <w:p>
             <w:pPr>
+              <w:spacing w:after="0"/>
               <w:jc w:val="center"/>
             </w:pPr>
             <w:r>
@@ -8208,6 +8411,7 @@
           </w:tcPr>
           <w:p>
             <w:pPr>
+              <w:spacing w:after="0"/>
               <w:jc w:val="center"/>
             </w:pPr>
             <w:r>
@@ -8238,6 +8442,7 @@
           </w:tcPr>
           <w:p>
             <w:pPr>
+              <w:spacing w:after="0"/>
               <w:jc w:val="center"/>
             </w:pPr>
             <w:r>
@@ -8268,6 +8473,7 @@
           </w:tcPr>
           <w:p>
             <w:pPr>
+              <w:spacing w:after="0"/>
               <w:jc w:val="center"/>
             </w:pPr>
             <w:r>
@@ -8300,6 +8506,7 @@
           </w:tcPr>
           <w:p>
             <w:pPr>
+              <w:spacing w:after="0"/>
               <w:jc w:val="center"/>
             </w:pPr>
             <w:r>
@@ -8330,6 +8537,7 @@
           </w:tcPr>
           <w:p>
             <w:pPr>
+              <w:spacing w:after="0"/>
               <w:jc w:val="center"/>
             </w:pPr>
             <w:r>
@@ -8360,6 +8568,7 @@
           </w:tcPr>
           <w:p>
             <w:pPr>
+              <w:spacing w:after="0"/>
               <w:jc w:val="center"/>
             </w:pPr>
             <w:r>
@@ -8390,6 +8599,7 @@
           </w:tcPr>
           <w:p>
             <w:pPr>
+              <w:spacing w:after="0"/>
               <w:jc w:val="center"/>
             </w:pPr>
             <w:r>
@@ -8420,6 +8630,7 @@
           </w:tcPr>
           <w:p>
             <w:pPr>
+              <w:spacing w:after="0"/>
               <w:jc w:val="center"/>
             </w:pPr>
             <w:r>
@@ -8450,6 +8661,7 @@
           </w:tcPr>
           <w:p>
             <w:pPr>
+              <w:spacing w:after="0"/>
               <w:jc w:val="center"/>
             </w:pPr>
             <w:r>
@@ -8480,6 +8692,7 @@
           </w:tcPr>
           <w:p>
             <w:pPr>
+              <w:spacing w:after="0"/>
               <w:jc w:val="center"/>
             </w:pPr>
             <w:r>
@@ -8510,6 +8723,7 @@
           </w:tcPr>
           <w:p>
             <w:pPr>
+              <w:spacing w:after="0"/>
               <w:jc w:val="center"/>
             </w:pPr>
             <w:r>
@@ -8542,6 +8756,7 @@
           </w:tcPr>
           <w:p>
             <w:pPr>
+              <w:spacing w:after="0"/>
               <w:jc w:val="center"/>
             </w:pPr>
             <w:r>
@@ -8572,6 +8787,7 @@
           </w:tcPr>
           <w:p>
             <w:pPr>
+              <w:spacing w:after="0"/>
               <w:jc w:val="center"/>
             </w:pPr>
             <w:r>
@@ -8602,6 +8818,7 @@
           </w:tcPr>
           <w:p>
             <w:pPr>
+              <w:spacing w:after="0"/>
               <w:jc w:val="center"/>
             </w:pPr>
             <w:r>
@@ -8632,6 +8849,7 @@
           </w:tcPr>
           <w:p>
             <w:pPr>
+              <w:spacing w:after="0"/>
               <w:jc w:val="center"/>
             </w:pPr>
             <w:r>
@@ -8662,6 +8880,7 @@
           </w:tcPr>
           <w:p>
             <w:pPr>
+              <w:spacing w:after="0"/>
               <w:jc w:val="center"/>
             </w:pPr>
             <w:r>
@@ -8692,6 +8911,7 @@
           </w:tcPr>
           <w:p>
             <w:pPr>
+              <w:spacing w:after="0"/>
               <w:jc w:val="center"/>
             </w:pPr>
             <w:r>
@@ -8722,6 +8942,7 @@
           </w:tcPr>
           <w:p>
             <w:pPr>
+              <w:spacing w:after="0"/>
               <w:jc w:val="center"/>
             </w:pPr>
             <w:r>
@@ -8752,6 +8973,7 @@
           </w:tcPr>
           <w:p>
             <w:pPr>
+              <w:spacing w:after="0"/>
               <w:jc w:val="center"/>
             </w:pPr>
             <w:r>
@@ -8784,6 +9006,7 @@
           </w:tcPr>
           <w:p>
             <w:pPr>
+              <w:spacing w:after="0"/>
               <w:jc w:val="center"/>
             </w:pPr>
             <w:r>
@@ -8814,6 +9037,7 @@
           </w:tcPr>
           <w:p>
             <w:pPr>
+              <w:spacing w:after="0"/>
               <w:jc w:val="center"/>
             </w:pPr>
             <w:r>
@@ -8844,6 +9068,7 @@
           </w:tcPr>
           <w:p>
             <w:pPr>
+              <w:spacing w:after="0"/>
               <w:jc w:val="center"/>
             </w:pPr>
             <w:r>
@@ -8874,6 +9099,7 @@
           </w:tcPr>
           <w:p>
             <w:pPr>
+              <w:spacing w:after="0"/>
               <w:jc w:val="center"/>
             </w:pPr>
             <w:r>
@@ -8904,6 +9130,7 @@
           </w:tcPr>
           <w:p>
             <w:pPr>
+              <w:spacing w:after="0"/>
               <w:jc w:val="center"/>
             </w:pPr>
             <w:r>
@@ -8934,6 +9161,7 @@
           </w:tcPr>
           <w:p>
             <w:pPr>
+              <w:spacing w:after="0"/>
               <w:jc w:val="center"/>
             </w:pPr>
             <w:r>
@@ -8964,6 +9192,7 @@
           </w:tcPr>
           <w:p>
             <w:pPr>
+              <w:spacing w:after="0"/>
               <w:jc w:val="center"/>
             </w:pPr>
             <w:r>
@@ -8994,6 +9223,7 @@
           </w:tcPr>
           <w:p>
             <w:pPr>
+              <w:spacing w:after="0"/>
               <w:jc w:val="center"/>
             </w:pPr>
             <w:r>
@@ -9026,6 +9256,7 @@
           </w:tcPr>
           <w:p>
             <w:pPr>
+              <w:spacing w:after="0"/>
               <w:jc w:val="center"/>
             </w:pPr>
             <w:r>
@@ -9056,6 +9287,7 @@
           </w:tcPr>
           <w:p>
             <w:pPr>
+              <w:spacing w:after="0"/>
               <w:jc w:val="center"/>
             </w:pPr>
             <w:r>
@@ -9086,6 +9318,7 @@
           </w:tcPr>
           <w:p>
             <w:pPr>
+              <w:spacing w:after="0"/>
               <w:jc w:val="center"/>
             </w:pPr>
             <w:r>
@@ -9116,6 +9349,7 @@
           </w:tcPr>
           <w:p>
             <w:pPr>
+              <w:spacing w:after="0"/>
               <w:jc w:val="center"/>
             </w:pPr>
             <w:r>
@@ -9146,6 +9380,7 @@
           </w:tcPr>
           <w:p>
             <w:pPr>
+              <w:spacing w:after="0"/>
               <w:jc w:val="center"/>
             </w:pPr>
             <w:r>
@@ -9176,6 +9411,7 @@
           </w:tcPr>
           <w:p>
             <w:pPr>
+              <w:spacing w:after="0"/>
               <w:jc w:val="center"/>
             </w:pPr>
             <w:r>
@@ -9206,6 +9442,7 @@
           </w:tcPr>
           <w:p>
             <w:pPr>
+              <w:spacing w:after="0"/>
               <w:jc w:val="center"/>
             </w:pPr>
             <w:r>
@@ -9236,6 +9473,7 @@
           </w:tcPr>
           <w:p>
             <w:pPr>
+              <w:spacing w:after="0"/>
               <w:jc w:val="center"/>
             </w:pPr>
             <w:r>
@@ -9268,6 +9506,7 @@
           </w:tcPr>
           <w:p>
             <w:pPr>
+              <w:spacing w:after="0"/>
               <w:jc w:val="center"/>
             </w:pPr>
             <w:r>
@@ -9298,6 +9537,7 @@
           </w:tcPr>
           <w:p>
             <w:pPr>
+              <w:spacing w:after="0"/>
               <w:jc w:val="center"/>
             </w:pPr>
             <w:r>
@@ -9328,6 +9568,7 @@
           </w:tcPr>
           <w:p>
             <w:pPr>
+              <w:spacing w:after="0"/>
               <w:jc w:val="center"/>
             </w:pPr>
             <w:r>
@@ -9358,6 +9599,7 @@
           </w:tcPr>
           <w:p>
             <w:pPr>
+              <w:spacing w:after="0"/>
               <w:jc w:val="center"/>
             </w:pPr>
             <w:r>
@@ -9388,6 +9630,7 @@
           </w:tcPr>
           <w:p>
             <w:pPr>
+              <w:spacing w:after="0"/>
               <w:jc w:val="center"/>
             </w:pPr>
             <w:r>
@@ -9418,6 +9661,7 @@
           </w:tcPr>
           <w:p>
             <w:pPr>
+              <w:spacing w:after="0"/>
               <w:jc w:val="center"/>
             </w:pPr>
             <w:r>
@@ -9448,6 +9692,7 @@
           </w:tcPr>
           <w:p>
             <w:pPr>
+              <w:spacing w:after="0"/>
               <w:jc w:val="center"/>
             </w:pPr>
             <w:r>
@@ -9478,6 +9723,7 @@
           </w:tcPr>
           <w:p>
             <w:pPr>
+              <w:spacing w:after="0"/>
               <w:jc w:val="center"/>
             </w:pPr>
             <w:r>
@@ -9829,6 +10075,9 @@
             <w:shd w:val="clear" w:color="auto" w:fill="F0F0F0"/>
           </w:tcPr>
           <w:p>
+            <w:pPr>
+              <w:spacing w:after="0"/>
+            </w:pPr>
             <w:r>
               <w:rPr>
                 <w:b/>
@@ -9851,6 +10100,9 @@
             </w:sdtPr>
             <w:sdtContent>
               <w:p>
+                <w:pPr>
+                  <w:spacing w:after="0"/>
+                </w:pPr>
                 <w:r>
                   <w:rPr>
                     <w:i/>
@@ -9870,6 +10122,9 @@
             <w:shd w:val="clear" w:color="auto" w:fill="F0F0F0"/>
           </w:tcPr>
           <w:p>
+            <w:pPr>
+              <w:spacing w:after="0"/>
+            </w:pPr>
             <w:r>
               <w:rPr>
                 <w:b/>
@@ -9898,6 +10153,9 @@
             </w:sdtPr>
             <w:sdtContent>
               <w:p>
+                <w:pPr>
+                  <w:spacing w:after="0"/>
+                </w:pPr>
                 <w:r>
                   <w:rPr>
                     <w:i/>
@@ -9917,6 +10175,9 @@
             <w:shd w:val="clear" w:color="auto" w:fill="F0F0F0"/>
           </w:tcPr>
           <w:p>
+            <w:pPr>
+              <w:spacing w:after="0"/>
+            </w:pPr>
             <w:r>
               <w:rPr>
                 <w:b/>
@@ -9944,6 +10205,9 @@
             </w:sdtPr>
             <w:sdtContent>
               <w:p>
+                <w:pPr>
+                  <w:spacing w:after="0"/>
+                </w:pPr>
                 <w:r>
                   <w:rPr>
                     <w:i/>
@@ -9963,6 +10227,9 @@
             <w:shd w:val="clear" w:color="auto" w:fill="F0F0F0"/>
           </w:tcPr>
           <w:p>
+            <w:pPr>
+              <w:spacing w:after="0"/>
+            </w:pPr>
             <w:r>
               <w:rPr>
                 <w:b/>
@@ -9992,6 +10259,9 @@
             </w:sdtPr>
             <w:sdtContent>
               <w:p>
+                <w:pPr>
+                  <w:spacing w:after="0"/>
+                </w:pPr>
                 <w:r>
                   <w:rPr>
                     <w:i/>
@@ -10011,6 +10281,9 @@
             <w:shd w:val="clear" w:color="auto" w:fill="F0F0F0"/>
           </w:tcPr>
           <w:p>
+            <w:pPr>
+              <w:spacing w:after="0"/>
+            </w:pPr>
             <w:r>
               <w:rPr>
                 <w:b/>
@@ -10032,6 +10305,9 @@
             </w:sdtPr>
             <w:sdtContent>
               <w:p>
+                <w:pPr>
+                  <w:spacing w:after="0"/>
+                </w:pPr>
                 <w:r>
                   <w:rPr>
                     <w:i/>
@@ -10110,6 +10386,7 @@
           </w:tcPr>
           <w:p>
             <w:pPr>
+              <w:spacing w:after="0"/>
               <w:jc w:val="center"/>
             </w:pPr>
             <w:r>
@@ -10140,6 +10417,9 @@
             </w:tcMar>
           </w:tcPr>
           <w:p>
+            <w:pPr>
+              <w:spacing w:after="0"/>
+            </w:pPr>
             <w:r>
               <w:rPr>
                 <w:b/>
@@ -10168,6 +10448,9 @@
             </w:tcMar>
           </w:tcPr>
           <w:p>
+            <w:pPr>
+              <w:spacing w:after="0"/>
+            </w:pPr>
             <w:r>
               <w:rPr>
                 <w:b/>
@@ -10199,6 +10482,7 @@
           </w:tcPr>
           <w:p>
             <w:pPr>
+              <w:spacing w:after="0"/>
               <w:jc w:val="center"/>
             </w:pPr>
             <w:r>
@@ -10228,6 +10512,9 @@
             </w:tcMar>
           </w:tcPr>
           <w:p>
+            <w:pPr>
+              <w:spacing w:after="0"/>
+            </w:pPr>
             <w:r>
               <w:rPr>
                 <w:b/>
@@ -10257,6 +10544,9 @@
             </w:tcMar>
           </w:tcPr>
           <w:p>
+            <w:pPr>
+              <w:spacing w:after="0"/>
+            </w:pPr>
             <w:r>
               <w:rPr>
                 <w:sz w:val="18"/>
@@ -10287,6 +10577,7 @@
           </w:tcPr>
           <w:p>
             <w:pPr>
+              <w:spacing w:after="0"/>
               <w:jc w:val="center"/>
             </w:pPr>
             <w:r>
@@ -10316,6 +10607,9 @@
             </w:tcMar>
           </w:tcPr>
           <w:p>
+            <w:pPr>
+              <w:spacing w:after="0"/>
+            </w:pPr>
             <w:r>
               <w:rPr>
                 <w:b/>
@@ -10345,6 +10639,9 @@
             </w:tcMar>
           </w:tcPr>
           <w:p>
+            <w:pPr>
+              <w:spacing w:after="0"/>
+            </w:pPr>
             <w:r>
               <w:rPr>
                 <w:sz w:val="18"/>
@@ -10375,6 +10672,7 @@
           </w:tcPr>
           <w:p>
             <w:pPr>
+              <w:spacing w:after="0"/>
               <w:jc w:val="center"/>
             </w:pPr>
             <w:r>
@@ -10404,6 +10702,9 @@
             </w:tcMar>
           </w:tcPr>
           <w:p>
+            <w:pPr>
+              <w:spacing w:after="0"/>
+            </w:pPr>
             <w:r>
               <w:rPr>
                 <w:b/>
@@ -10433,6 +10734,9 @@
             </w:tcMar>
           </w:tcPr>
           <w:p>
+            <w:pPr>
+              <w:spacing w:after="0"/>
+            </w:pPr>
             <w:r>
               <w:rPr>
                 <w:sz w:val="18"/>
@@ -10463,6 +10767,7 @@
           </w:tcPr>
           <w:p>
             <w:pPr>
+              <w:spacing w:after="0"/>
               <w:jc w:val="center"/>
             </w:pPr>
             <w:r>
@@ -10492,6 +10797,9 @@
             </w:tcMar>
           </w:tcPr>
           <w:p>
+            <w:pPr>
+              <w:spacing w:after="0"/>
+            </w:pPr>
             <w:r>
               <w:rPr>
                 <w:b/>
@@ -10521,6 +10829,9 @@
             </w:tcMar>
           </w:tcPr>
           <w:p>
+            <w:pPr>
+              <w:spacing w:after="0"/>
+            </w:pPr>
             <w:r>
               <w:rPr>
                 <w:sz w:val="18"/>
@@ -10551,6 +10862,7 @@
           </w:tcPr>
           <w:p>
             <w:pPr>
+              <w:spacing w:after="0"/>
               <w:jc w:val="center"/>
             </w:pPr>
             <w:r>
@@ -10580,6 +10892,9 @@
             </w:tcMar>
           </w:tcPr>
           <w:p>
+            <w:pPr>
+              <w:spacing w:after="0"/>
+            </w:pPr>
             <w:r>
               <w:rPr>
                 <w:b/>
@@ -10609,6 +10924,9 @@
             </w:tcMar>
           </w:tcPr>
           <w:p>
+            <w:pPr>
+              <w:spacing w:after="0"/>
+            </w:pPr>
             <w:r>
               <w:rPr>
                 <w:sz w:val="18"/>
@@ -10639,6 +10957,7 @@
           </w:tcPr>
           <w:p>
             <w:pPr>
+              <w:spacing w:after="0"/>
               <w:jc w:val="center"/>
             </w:pPr>
             <w:r>
@@ -10668,6 +10987,9 @@
             </w:tcMar>
           </w:tcPr>
           <w:p>
+            <w:pPr>
+              <w:spacing w:after="0"/>
+            </w:pPr>
             <w:r>
               <w:rPr>
                 <w:b/>
@@ -10697,6 +11019,9 @@
             </w:tcMar>
           </w:tcPr>
           <w:p>
+            <w:pPr>
+              <w:spacing w:after="0"/>
+            </w:pPr>
             <w:r>
               <w:rPr>
                 <w:sz w:val="18"/>
@@ -10727,6 +11052,7 @@
           </w:tcPr>
           <w:p>
             <w:pPr>
+              <w:spacing w:after="0"/>
               <w:jc w:val="center"/>
             </w:pPr>
             <w:r>
@@ -10756,6 +11082,9 @@
             </w:tcMar>
           </w:tcPr>
           <w:p>
+            <w:pPr>
+              <w:spacing w:after="0"/>
+            </w:pPr>
             <w:r>
               <w:rPr>
                 <w:b/>
@@ -10785,6 +11114,9 @@
             </w:tcMar>
           </w:tcPr>
           <w:p>
+            <w:pPr>
+              <w:spacing w:after="0"/>
+            </w:pPr>
             <w:r>
               <w:rPr>
                 <w:sz w:val="18"/>
@@ -10815,6 +11147,7 @@
           </w:tcPr>
           <w:p>
             <w:pPr>
+              <w:spacing w:after="0"/>
               <w:jc w:val="center"/>
             </w:pPr>
             <w:r>
@@ -10844,6 +11177,9 @@
             </w:tcMar>
           </w:tcPr>
           <w:p>
+            <w:pPr>
+              <w:spacing w:after="0"/>
+            </w:pPr>
             <w:r>
               <w:rPr>
                 <w:b/>
@@ -10873,6 +11209,9 @@
             </w:tcMar>
           </w:tcPr>
           <w:p>
+            <w:pPr>
+              <w:spacing w:after="0"/>
+            </w:pPr>
             <w:r>
               <w:rPr>
                 <w:sz w:val="18"/>
@@ -10903,6 +11242,7 @@
           </w:tcPr>
           <w:p>
             <w:pPr>
+              <w:spacing w:after="0"/>
               <w:jc w:val="center"/>
             </w:pPr>
             <w:r>
@@ -10932,6 +11272,9 @@
             </w:tcMar>
           </w:tcPr>
           <w:p>
+            <w:pPr>
+              <w:spacing w:after="0"/>
+            </w:pPr>
             <w:r>
               <w:rPr>
                 <w:b/>
@@ -10961,6 +11304,9 @@
             </w:tcMar>
           </w:tcPr>
           <w:p>
+            <w:pPr>
+              <w:spacing w:after="0"/>
+            </w:pPr>
             <w:r>
               <w:rPr>
                 <w:sz w:val="18"/>
@@ -10991,6 +11337,7 @@
           </w:tcPr>
           <w:p>
             <w:pPr>
+              <w:spacing w:after="0"/>
               <w:jc w:val="center"/>
             </w:pPr>
             <w:r>
@@ -11020,6 +11367,9 @@
             </w:tcMar>
           </w:tcPr>
           <w:p>
+            <w:pPr>
+              <w:spacing w:after="0"/>
+            </w:pPr>
             <w:r>
               <w:rPr>
                 <w:b/>
@@ -11049,6 +11399,9 @@
             </w:tcMar>
           </w:tcPr>
           <w:p>
+            <w:pPr>
+              <w:spacing w:after="0"/>
+            </w:pPr>
             <w:r>
               <w:rPr>
                 <w:sz w:val="18"/>
@@ -11079,6 +11432,7 @@
           </w:tcPr>
           <w:p>
             <w:pPr>
+              <w:spacing w:after="0"/>
               <w:jc w:val="center"/>
             </w:pPr>
             <w:r>
@@ -11108,6 +11462,9 @@
             </w:tcMar>
           </w:tcPr>
           <w:p>
+            <w:pPr>
+              <w:spacing w:after="0"/>
+            </w:pPr>
             <w:r>
               <w:rPr>
                 <w:b/>
@@ -11137,6 +11494,9 @@
             </w:tcMar>
           </w:tcPr>
           <w:p>
+            <w:pPr>
+              <w:spacing w:after="0"/>
+            </w:pPr>
             <w:r>
               <w:rPr>
                 <w:sz w:val="18"/>
@@ -11167,6 +11527,7 @@
           </w:tcPr>
           <w:p>
             <w:pPr>
+              <w:spacing w:after="0"/>
               <w:jc w:val="center"/>
             </w:pPr>
             <w:r>
@@ -11196,6 +11557,9 @@
             </w:tcMar>
           </w:tcPr>
           <w:p>
+            <w:pPr>
+              <w:spacing w:after="0"/>
+            </w:pPr>
             <w:r>
               <w:rPr>
                 <w:b/>
@@ -11225,6 +11589,9 @@
             </w:tcMar>
           </w:tcPr>
           <w:p>
+            <w:pPr>
+              <w:spacing w:after="0"/>
+            </w:pPr>
             <w:r>
               <w:rPr>
                 <w:sz w:val="18"/>
@@ -11255,6 +11622,7 @@
           </w:tcPr>
           <w:p>
             <w:pPr>
+              <w:spacing w:after="0"/>
               <w:jc w:val="center"/>
             </w:pPr>
             <w:r>
@@ -11284,6 +11652,9 @@
             </w:tcMar>
           </w:tcPr>
           <w:p>
+            <w:pPr>
+              <w:spacing w:after="0"/>
+            </w:pPr>
             <w:r>
               <w:rPr>
                 <w:b/>
@@ -11313,6 +11684,9 @@
             </w:tcMar>
           </w:tcPr>
           <w:p>
+            <w:pPr>
+              <w:spacing w:after="0"/>
+            </w:pPr>
             <w:r>
               <w:rPr>
                 <w:sz w:val="18"/>
@@ -11343,6 +11717,7 @@
           </w:tcPr>
           <w:p>
             <w:pPr>
+              <w:spacing w:after="0"/>
               <w:jc w:val="center"/>
             </w:pPr>
             <w:r>
@@ -11372,6 +11747,9 @@
             </w:tcMar>
           </w:tcPr>
           <w:p>
+            <w:pPr>
+              <w:spacing w:after="0"/>
+            </w:pPr>
             <w:r>
               <w:rPr>
                 <w:b/>
@@ -11401,6 +11779,9 @@
             </w:tcMar>
           </w:tcPr>
           <w:p>
+            <w:pPr>
+              <w:spacing w:after="0"/>
+            </w:pPr>
             <w:r>
               <w:rPr>
                 <w:sz w:val="18"/>
@@ -11431,6 +11812,7 @@
           </w:tcPr>
           <w:p>
             <w:pPr>
+              <w:spacing w:after="0"/>
               <w:jc w:val="center"/>
             </w:pPr>
             <w:r>
@@ -11460,6 +11842,9 @@
             </w:tcMar>
           </w:tcPr>
           <w:p>
+            <w:pPr>
+              <w:spacing w:after="0"/>
+            </w:pPr>
             <w:r>
               <w:rPr>
                 <w:b/>
@@ -11489,6 +11874,9 @@
             </w:tcMar>
           </w:tcPr>
           <w:p>
+            <w:pPr>
+              <w:spacing w:after="0"/>
+            </w:pPr>
             <w:r>
               <w:rPr>
                 <w:sz w:val="18"/>
@@ -11519,6 +11907,7 @@
           </w:tcPr>
           <w:p>
             <w:pPr>
+              <w:spacing w:after="0"/>
               <w:jc w:val="center"/>
             </w:pPr>
             <w:r>
@@ -11548,6 +11937,9 @@
             </w:tcMar>
           </w:tcPr>
           <w:p>
+            <w:pPr>
+              <w:spacing w:after="0"/>
+            </w:pPr>
             <w:r>
               <w:rPr>
                 <w:b/>
@@ -11577,6 +11969,9 @@
             </w:tcMar>
           </w:tcPr>
           <w:p>
+            <w:pPr>
+              <w:spacing w:after="0"/>
+            </w:pPr>
             <w:r>
               <w:rPr>
                 <w:sz w:val="18"/>
@@ -11607,6 +12002,7 @@
           </w:tcPr>
           <w:p>
             <w:pPr>
+              <w:spacing w:after="0"/>
               <w:jc w:val="center"/>
             </w:pPr>
             <w:r>
@@ -11636,6 +12032,9 @@
             </w:tcMar>
           </w:tcPr>
           <w:p>
+            <w:pPr>
+              <w:spacing w:after="0"/>
+            </w:pPr>
             <w:r>
               <w:rPr>
                 <w:b/>
@@ -11665,6 +12064,9 @@
             </w:tcMar>
           </w:tcPr>
           <w:p>
+            <w:pPr>
+              <w:spacing w:after="0"/>
+            </w:pPr>
             <w:r>
               <w:rPr>
                 <w:sz w:val="18"/>
@@ -11695,6 +12097,7 @@
           </w:tcPr>
           <w:p>
             <w:pPr>
+              <w:spacing w:after="0"/>
               <w:jc w:val="center"/>
             </w:pPr>
             <w:r>
@@ -11724,6 +12127,9 @@
             </w:tcMar>
           </w:tcPr>
           <w:p>
+            <w:pPr>
+              <w:spacing w:after="0"/>
+            </w:pPr>
             <w:r>
               <w:rPr>
                 <w:b/>
@@ -11753,6 +12159,9 @@
             </w:tcMar>
           </w:tcPr>
           <w:p>
+            <w:pPr>
+              <w:spacing w:after="0"/>
+            </w:pPr>
             <w:r>
               <w:rPr>
                 <w:sz w:val="18"/>
@@ -11783,6 +12192,7 @@
           </w:tcPr>
           <w:p>
             <w:pPr>
+              <w:spacing w:after="0"/>
               <w:jc w:val="center"/>
             </w:pPr>
             <w:r>
@@ -11812,6 +12222,9 @@
             </w:tcMar>
           </w:tcPr>
           <w:p>
+            <w:pPr>
+              <w:spacing w:after="0"/>
+            </w:pPr>
             <w:r>
               <w:rPr>
                 <w:b/>
@@ -11841,6 +12254,9 @@
             </w:tcMar>
           </w:tcPr>
           <w:p>
+            <w:pPr>
+              <w:spacing w:after="0"/>
+            </w:pPr>
             <w:r>
               <w:rPr>
                 <w:sz w:val="18"/>
@@ -11871,6 +12287,7 @@
           </w:tcPr>
           <w:p>
             <w:pPr>
+              <w:spacing w:after="0"/>
               <w:jc w:val="center"/>
             </w:pPr>
             <w:r>
@@ -11900,6 +12317,9 @@
             </w:tcMar>
           </w:tcPr>
           <w:p>
+            <w:pPr>
+              <w:spacing w:after="0"/>
+            </w:pPr>
             <w:r>
               <w:rPr>
                 <w:b/>
@@ -11929,6 +12349,9 @@
             </w:tcMar>
           </w:tcPr>
           <w:p>
+            <w:pPr>
+              <w:spacing w:after="0"/>
+            </w:pPr>
             <w:r>
               <w:rPr>
                 <w:sz w:val="18"/>
@@ -11959,6 +12382,7 @@
           </w:tcPr>
           <w:p>
             <w:pPr>
+              <w:spacing w:after="0"/>
               <w:jc w:val="center"/>
             </w:pPr>
             <w:r>
@@ -11988,6 +12412,9 @@
             </w:tcMar>
           </w:tcPr>
           <w:p>
+            <w:pPr>
+              <w:spacing w:after="0"/>
+            </w:pPr>
             <w:r>
               <w:rPr>
                 <w:b/>
@@ -12017,6 +12444,9 @@
             </w:tcMar>
           </w:tcPr>
           <w:p>
+            <w:pPr>
+              <w:spacing w:after="0"/>
+            </w:pPr>
             <w:r>
               <w:rPr>
                 <w:sz w:val="18"/>
@@ -12047,6 +12477,7 @@
           </w:tcPr>
           <w:p>
             <w:pPr>
+              <w:spacing w:after="0"/>
               <w:jc w:val="center"/>
             </w:pPr>
             <w:r>
@@ -12076,6 +12507,9 @@
             </w:tcMar>
           </w:tcPr>
           <w:p>
+            <w:pPr>
+              <w:spacing w:after="0"/>
+            </w:pPr>
             <w:r>
               <w:rPr>
                 <w:b/>
@@ -12105,6 +12539,9 @@
             </w:tcMar>
           </w:tcPr>
           <w:p>
+            <w:pPr>
+              <w:spacing w:after="0"/>
+            </w:pPr>
             <w:r>
               <w:rPr>
                 <w:sz w:val="18"/>
@@ -12135,6 +12572,7 @@
           </w:tcPr>
           <w:p>
             <w:pPr>
+              <w:spacing w:after="0"/>
               <w:jc w:val="center"/>
             </w:pPr>
             <w:r>
@@ -12164,6 +12602,9 @@
             </w:tcMar>
           </w:tcPr>
           <w:p>
+            <w:pPr>
+              <w:spacing w:after="0"/>
+            </w:pPr>
             <w:r>
               <w:rPr>
                 <w:b/>
@@ -12193,6 +12634,9 @@
             </w:tcMar>
           </w:tcPr>
           <w:p>
+            <w:pPr>
+              <w:spacing w:after="0"/>
+            </w:pPr>
             <w:r>
               <w:rPr>
                 <w:sz w:val="18"/>
@@ -12223,6 +12667,7 @@
           </w:tcPr>
           <w:p>
             <w:pPr>
+              <w:spacing w:after="0"/>
               <w:jc w:val="center"/>
             </w:pPr>
             <w:r>
@@ -12252,6 +12697,9 @@
             </w:tcMar>
           </w:tcPr>
           <w:p>
+            <w:pPr>
+              <w:spacing w:after="0"/>
+            </w:pPr>
             <w:r>
               <w:rPr>
                 <w:b/>
@@ -12281,6 +12729,9 @@
             </w:tcMar>
           </w:tcPr>
           <w:p>
+            <w:pPr>
+              <w:spacing w:after="0"/>
+            </w:pPr>
             <w:r>
               <w:rPr>
                 <w:sz w:val="18"/>
@@ -12311,6 +12762,7 @@
           </w:tcPr>
           <w:p>
             <w:pPr>
+              <w:spacing w:after="0"/>
               <w:jc w:val="center"/>
             </w:pPr>
             <w:r>
@@ -12340,6 +12792,9 @@
             </w:tcMar>
           </w:tcPr>
           <w:p>
+            <w:pPr>
+              <w:spacing w:after="0"/>
+            </w:pPr>
             <w:r>
               <w:rPr>
                 <w:b/>
@@ -12369,6 +12824,9 @@
             </w:tcMar>
           </w:tcPr>
           <w:p>
+            <w:pPr>
+              <w:spacing w:after="0"/>
+            </w:pPr>
             <w:r>
               <w:rPr>
                 <w:sz w:val="18"/>
@@ -12399,6 +12857,7 @@
           </w:tcPr>
           <w:p>
             <w:pPr>
+              <w:spacing w:after="0"/>
               <w:jc w:val="center"/>
             </w:pPr>
             <w:r>
@@ -12428,6 +12887,9 @@
             </w:tcMar>
           </w:tcPr>
           <w:p>
+            <w:pPr>
+              <w:spacing w:after="0"/>
+            </w:pPr>
             <w:r>
               <w:rPr>
                 <w:b/>
@@ -12457,6 +12919,9 @@
             </w:tcMar>
           </w:tcPr>
           <w:p>
+            <w:pPr>
+              <w:spacing w:after="0"/>
+            </w:pPr>
             <w:r>
               <w:rPr>
                 <w:sz w:val="18"/>
@@ -12487,6 +12952,7 @@
           </w:tcPr>
           <w:p>
             <w:pPr>
+              <w:spacing w:after="0"/>
               <w:jc w:val="center"/>
             </w:pPr>
             <w:r>
@@ -12516,6 +12982,9 @@
             </w:tcMar>
           </w:tcPr>
           <w:p>
+            <w:pPr>
+              <w:spacing w:after="0"/>
+            </w:pPr>
             <w:r>
               <w:rPr>
                 <w:b/>
@@ -12545,6 +13014,9 @@
             </w:tcMar>
           </w:tcPr>
           <w:p>
+            <w:pPr>
+              <w:spacing w:after="0"/>
+            </w:pPr>
             <w:r>
               <w:rPr>
                 <w:sz w:val="18"/>
@@ -12575,6 +13047,7 @@
           </w:tcPr>
           <w:p>
             <w:pPr>
+              <w:spacing w:after="0"/>
               <w:jc w:val="center"/>
             </w:pPr>
             <w:r>
@@ -12604,6 +13077,9 @@
             </w:tcMar>
           </w:tcPr>
           <w:p>
+            <w:pPr>
+              <w:spacing w:after="0"/>
+            </w:pPr>
             <w:r>
               <w:rPr>
                 <w:b/>
@@ -12633,6 +13109,9 @@
             </w:tcMar>
           </w:tcPr>
           <w:p>
+            <w:pPr>
+              <w:spacing w:after="0"/>
+            </w:pPr>
             <w:r>
               <w:rPr>
                 <w:sz w:val="18"/>
@@ -12663,6 +13142,7 @@
           </w:tcPr>
           <w:p>
             <w:pPr>
+              <w:spacing w:after="0"/>
               <w:jc w:val="center"/>
             </w:pPr>
             <w:r>
@@ -12692,6 +13172,9 @@
             </w:tcMar>
           </w:tcPr>
           <w:p>
+            <w:pPr>
+              <w:spacing w:after="0"/>
+            </w:pPr>
             <w:r>
               <w:rPr>
                 <w:b/>
@@ -12721,6 +13204,9 @@
             </w:tcMar>
           </w:tcPr>
           <w:p>
+            <w:pPr>
+              <w:spacing w:after="0"/>
+            </w:pPr>
             <w:r>
               <w:rPr>
                 <w:sz w:val="18"/>
@@ -12751,6 +13237,7 @@
           </w:tcPr>
           <w:p>
             <w:pPr>
+              <w:spacing w:after="0"/>
               <w:jc w:val="center"/>
             </w:pPr>
             <w:r>
@@ -12780,6 +13267,9 @@
             </w:tcMar>
           </w:tcPr>
           <w:p>
+            <w:pPr>
+              <w:spacing w:after="0"/>
+            </w:pPr>
             <w:r>
               <w:rPr>
                 <w:b/>
@@ -12809,6 +13299,9 @@
             </w:tcMar>
           </w:tcPr>
           <w:p>
+            <w:pPr>
+              <w:spacing w:after="0"/>
+            </w:pPr>
             <w:r>
               <w:rPr>
                 <w:sz w:val="18"/>
@@ -12839,6 +13332,7 @@
           </w:tcPr>
           <w:p>
             <w:pPr>
+              <w:spacing w:after="0"/>
               <w:jc w:val="center"/>
             </w:pPr>
             <w:r>
@@ -12868,6 +13362,9 @@
             </w:tcMar>
           </w:tcPr>
           <w:p>
+            <w:pPr>
+              <w:spacing w:after="0"/>
+            </w:pPr>
             <w:r>
               <w:rPr>
                 <w:b/>
@@ -12897,6 +13394,9 @@
             </w:tcMar>
           </w:tcPr>
           <w:p>
+            <w:pPr>
+              <w:spacing w:after="0"/>
+            </w:pPr>
             <w:r>
               <w:rPr>
                 <w:sz w:val="18"/>
@@ -12927,6 +13427,7 @@
           </w:tcPr>
           <w:p>
             <w:pPr>
+              <w:spacing w:after="0"/>
               <w:jc w:val="center"/>
             </w:pPr>
             <w:r>
@@ -12956,6 +13457,9 @@
             </w:tcMar>
           </w:tcPr>
           <w:p>
+            <w:pPr>
+              <w:spacing w:after="0"/>
+            </w:pPr>
             <w:r>
               <w:rPr>
                 <w:b/>
@@ -12985,6 +13489,9 @@
             </w:tcMar>
           </w:tcPr>
           <w:p>
+            <w:pPr>
+              <w:spacing w:after="0"/>
+            </w:pPr>
             <w:r>
               <w:rPr>
                 <w:sz w:val="18"/>
@@ -13015,6 +13522,7 @@
           </w:tcPr>
           <w:p>
             <w:pPr>
+              <w:spacing w:after="0"/>
               <w:jc w:val="center"/>
             </w:pPr>
             <w:r>
@@ -13044,6 +13552,9 @@
             </w:tcMar>
           </w:tcPr>
           <w:p>
+            <w:pPr>
+              <w:spacing w:after="0"/>
+            </w:pPr>
             <w:r>
               <w:rPr>
                 <w:b/>
@@ -13073,6 +13584,9 @@
             </w:tcMar>
           </w:tcPr>
           <w:p>
+            <w:pPr>
+              <w:spacing w:after="0"/>
+            </w:pPr>
             <w:r>
               <w:rPr>
                 <w:sz w:val="18"/>
@@ -13103,6 +13617,7 @@
           </w:tcPr>
           <w:p>
             <w:pPr>
+              <w:spacing w:after="0"/>
               <w:jc w:val="center"/>
             </w:pPr>
             <w:r>
@@ -13132,6 +13647,9 @@
             </w:tcMar>
           </w:tcPr>
           <w:p>
+            <w:pPr>
+              <w:spacing w:after="0"/>
+            </w:pPr>
             <w:r>
               <w:rPr>
                 <w:b/>
@@ -13161,6 +13679,9 @@
             </w:tcMar>
           </w:tcPr>
           <w:p>
+            <w:pPr>
+              <w:spacing w:after="0"/>
+            </w:pPr>
             <w:r>
               <w:rPr>
                 <w:sz w:val="18"/>
@@ -13191,6 +13712,7 @@
           </w:tcPr>
           <w:p>
             <w:pPr>
+              <w:spacing w:after="0"/>
               <w:jc w:val="center"/>
             </w:pPr>
             <w:r>
@@ -13220,6 +13742,9 @@
             </w:tcMar>
           </w:tcPr>
           <w:p>
+            <w:pPr>
+              <w:spacing w:after="0"/>
+            </w:pPr>
             <w:r>
               <w:rPr>
                 <w:b/>
@@ -13249,6 +13774,9 @@
             </w:tcMar>
           </w:tcPr>
           <w:p>
+            <w:pPr>
+              <w:spacing w:after="0"/>
+            </w:pPr>
             <w:r>
               <w:rPr>
                 <w:sz w:val="18"/>
@@ -13279,6 +13807,7 @@
           </w:tcPr>
           <w:p>
             <w:pPr>
+              <w:spacing w:after="0"/>
               <w:jc w:val="center"/>
             </w:pPr>
             <w:r>
@@ -13308,6 +13837,9 @@
             </w:tcMar>
           </w:tcPr>
           <w:p>
+            <w:pPr>
+              <w:spacing w:after="0"/>
+            </w:pPr>
             <w:r>
               <w:rPr>
                 <w:b/>
@@ -13337,6 +13869,9 @@
             </w:tcMar>
           </w:tcPr>
           <w:p>
+            <w:pPr>
+              <w:spacing w:after="0"/>
+            </w:pPr>
             <w:r>
               <w:rPr>
                 <w:sz w:val="18"/>
@@ -13367,6 +13902,7 @@
           </w:tcPr>
           <w:p>
             <w:pPr>
+              <w:spacing w:after="0"/>
               <w:jc w:val="center"/>
             </w:pPr>
             <w:r>
@@ -13396,6 +13932,9 @@
             </w:tcMar>
           </w:tcPr>
           <w:p>
+            <w:pPr>
+              <w:spacing w:after="0"/>
+            </w:pPr>
             <w:r>
               <w:rPr>
                 <w:b/>
@@ -13425,6 +13964,9 @@
             </w:tcMar>
           </w:tcPr>
           <w:p>
+            <w:pPr>
+              <w:spacing w:after="0"/>
+            </w:pPr>
             <w:r>
               <w:rPr>
                 <w:sz w:val="18"/>
@@ -13455,6 +13997,7 @@
           </w:tcPr>
           <w:p>
             <w:pPr>
+              <w:spacing w:after="0"/>
               <w:jc w:val="center"/>
             </w:pPr>
             <w:r>
@@ -13484,6 +14027,9 @@
             </w:tcMar>
           </w:tcPr>
           <w:p>
+            <w:pPr>
+              <w:spacing w:after="0"/>
+            </w:pPr>
             <w:r>
               <w:rPr>
                 <w:b/>
@@ -13513,6 +14059,9 @@
             </w:tcMar>
           </w:tcPr>
           <w:p>
+            <w:pPr>
+              <w:spacing w:after="0"/>
+            </w:pPr>
             <w:r>
               <w:rPr>
                 <w:sz w:val="18"/>
@@ -13543,6 +14092,7 @@
           </w:tcPr>
           <w:p>
             <w:pPr>
+              <w:spacing w:after="0"/>
               <w:jc w:val="center"/>
             </w:pPr>
             <w:r>
@@ -13572,6 +14122,9 @@
             </w:tcMar>
           </w:tcPr>
           <w:p>
+            <w:pPr>
+              <w:spacing w:after="0"/>
+            </w:pPr>
             <w:r>
               <w:rPr>
                 <w:b/>
@@ -13601,6 +14154,9 @@
             </w:tcMar>
           </w:tcPr>
           <w:p>
+            <w:pPr>
+              <w:spacing w:after="0"/>
+            </w:pPr>
             <w:r>
               <w:rPr>
                 <w:sz w:val="18"/>
@@ -13631,6 +14187,7 @@
           </w:tcPr>
           <w:p>
             <w:pPr>
+              <w:spacing w:after="0"/>
               <w:jc w:val="center"/>
             </w:pPr>
             <w:r>
@@ -13660,6 +14217,9 @@
             </w:tcMar>
           </w:tcPr>
           <w:p>
+            <w:pPr>
+              <w:spacing w:after="0"/>
+            </w:pPr>
             <w:r>
               <w:rPr>
                 <w:b/>
@@ -13689,6 +14249,9 @@
             </w:tcMar>
           </w:tcPr>
           <w:p>
+            <w:pPr>
+              <w:spacing w:after="0"/>
+            </w:pPr>
             <w:r>
               <w:rPr>
                 <w:sz w:val="18"/>
@@ -13719,6 +14282,7 @@
           </w:tcPr>
           <w:p>
             <w:pPr>
+              <w:spacing w:after="0"/>
               <w:jc w:val="center"/>
             </w:pPr>
             <w:r>
@@ -13748,6 +14312,9 @@
             </w:tcMar>
           </w:tcPr>
           <w:p>
+            <w:pPr>
+              <w:spacing w:after="0"/>
+            </w:pPr>
             <w:r>
               <w:rPr>
                 <w:b/>
@@ -13777,6 +14344,9 @@
             </w:tcMar>
           </w:tcPr>
           <w:p>
+            <w:pPr>
+              <w:spacing w:after="0"/>
+            </w:pPr>
             <w:r>
               <w:rPr>
                 <w:sz w:val="18"/>
@@ -13807,6 +14377,7 @@
           </w:tcPr>
           <w:p>
             <w:pPr>
+              <w:spacing w:after="0"/>
               <w:jc w:val="center"/>
             </w:pPr>
             <w:r>
@@ -13836,6 +14407,9 @@
             </w:tcMar>
           </w:tcPr>
           <w:p>
+            <w:pPr>
+              <w:spacing w:after="0"/>
+            </w:pPr>
             <w:r>
               <w:rPr>
                 <w:b/>
@@ -13865,6 +14439,9 @@
             </w:tcMar>
           </w:tcPr>
           <w:p>
+            <w:pPr>
+              <w:spacing w:after="0"/>
+            </w:pPr>
             <w:r>
               <w:rPr>
                 <w:sz w:val="18"/>
@@ -13895,6 +14472,7 @@
           </w:tcPr>
           <w:p>
             <w:pPr>
+              <w:spacing w:after="0"/>
               <w:jc w:val="center"/>
             </w:pPr>
             <w:r>
@@ -13924,6 +14502,9 @@
             </w:tcMar>
           </w:tcPr>
           <w:p>
+            <w:pPr>
+              <w:spacing w:after="0"/>
+            </w:pPr>
             <w:r>
               <w:rPr>
                 <w:b/>
@@ -13953,6 +14534,9 @@
             </w:tcMar>
           </w:tcPr>
           <w:p>
+            <w:pPr>
+              <w:spacing w:after="0"/>
+            </w:pPr>
             <w:r>
               <w:rPr>
                 <w:sz w:val="18"/>
@@ -13983,6 +14567,7 @@
           </w:tcPr>
           <w:p>
             <w:pPr>
+              <w:spacing w:after="0"/>
               <w:jc w:val="center"/>
             </w:pPr>
             <w:r>
@@ -14012,6 +14597,9 @@
             </w:tcMar>
           </w:tcPr>
           <w:p>
+            <w:pPr>
+              <w:spacing w:after="0"/>
+            </w:pPr>
             <w:r>
               <w:rPr>
                 <w:b/>
@@ -14041,6 +14629,9 @@
             </w:tcMar>
           </w:tcPr>
           <w:p>
+            <w:pPr>
+              <w:spacing w:after="0"/>
+            </w:pPr>
             <w:r>
               <w:rPr>
                 <w:sz w:val="18"/>
@@ -14071,6 +14662,7 @@
           </w:tcPr>
           <w:p>
             <w:pPr>
+              <w:spacing w:after="0"/>
               <w:jc w:val="center"/>
             </w:pPr>
             <w:r>
@@ -14100,6 +14692,9 @@
             </w:tcMar>
           </w:tcPr>
           <w:p>
+            <w:pPr>
+              <w:spacing w:after="0"/>
+            </w:pPr>
             <w:r>
               <w:rPr>
                 <w:b/>
@@ -14129,6 +14724,9 @@
             </w:tcMar>
           </w:tcPr>
           <w:p>
+            <w:pPr>
+              <w:spacing w:after="0"/>
+            </w:pPr>
             <w:r>
               <w:rPr>
                 <w:sz w:val="18"/>
@@ -14159,6 +14757,7 @@
           </w:tcPr>
           <w:p>
             <w:pPr>
+              <w:spacing w:after="0"/>
               <w:jc w:val="center"/>
             </w:pPr>
             <w:r>
@@ -14188,6 +14787,9 @@
             </w:tcMar>
           </w:tcPr>
           <w:p>
+            <w:pPr>
+              <w:spacing w:after="0"/>
+            </w:pPr>
             <w:r>
               <w:rPr>
                 <w:b/>
@@ -14217,6 +14819,9 @@
             </w:tcMar>
           </w:tcPr>
           <w:p>
+            <w:pPr>
+              <w:spacing w:after="0"/>
+            </w:pPr>
             <w:r>
               <w:rPr>
                 <w:sz w:val="18"/>
@@ -14247,6 +14852,7 @@
           </w:tcPr>
           <w:p>
             <w:pPr>
+              <w:spacing w:after="0"/>
               <w:jc w:val="center"/>
             </w:pPr>
             <w:r>
@@ -14276,6 +14882,9 @@
             </w:tcMar>
           </w:tcPr>
           <w:p>
+            <w:pPr>
+              <w:spacing w:after="0"/>
+            </w:pPr>
             <w:r>
               <w:rPr>
                 <w:b/>
@@ -14305,6 +14914,9 @@
             </w:tcMar>
           </w:tcPr>
           <w:p>
+            <w:pPr>
+              <w:spacing w:after="0"/>
+            </w:pPr>
             <w:r>
               <w:rPr>
                 <w:sz w:val="18"/>
@@ -14335,6 +14947,7 @@
           </w:tcPr>
           <w:p>
             <w:pPr>
+              <w:spacing w:after="0"/>
               <w:jc w:val="center"/>
             </w:pPr>
             <w:r>
@@ -14364,6 +14977,9 @@
             </w:tcMar>
           </w:tcPr>
           <w:p>
+            <w:pPr>
+              <w:spacing w:after="0"/>
+            </w:pPr>
             <w:r>
               <w:rPr>
                 <w:b/>
@@ -14393,6 +15009,9 @@
             </w:tcMar>
           </w:tcPr>
           <w:p>
+            <w:pPr>
+              <w:spacing w:after="0"/>
+            </w:pPr>
             <w:r>
               <w:rPr>
                 <w:sz w:val="18"/>
@@ -14423,6 +15042,7 @@
           </w:tcPr>
           <w:p>
             <w:pPr>
+              <w:spacing w:after="0"/>
               <w:jc w:val="center"/>
             </w:pPr>
             <w:r>
@@ -14452,6 +15072,9 @@
             </w:tcMar>
           </w:tcPr>
           <w:p>
+            <w:pPr>
+              <w:spacing w:after="0"/>
+            </w:pPr>
             <w:r>
               <w:rPr>
                 <w:b/>
@@ -14481,6 +15104,9 @@
             </w:tcMar>
           </w:tcPr>
           <w:p>
+            <w:pPr>
+              <w:spacing w:after="0"/>
+            </w:pPr>
             <w:r>
               <w:rPr>
                 <w:sz w:val="18"/>
@@ -14511,6 +15137,7 @@
           </w:tcPr>
           <w:p>
             <w:pPr>
+              <w:spacing w:after="0"/>
               <w:jc w:val="center"/>
             </w:pPr>
             <w:r>
@@ -14540,6 +15167,9 @@
             </w:tcMar>
           </w:tcPr>
           <w:p>
+            <w:pPr>
+              <w:spacing w:after="0"/>
+            </w:pPr>
             <w:r>
               <w:rPr>
                 <w:b/>
@@ -14569,6 +15199,9 @@
             </w:tcMar>
           </w:tcPr>
           <w:p>
+            <w:pPr>
+              <w:spacing w:after="0"/>
+            </w:pPr>
             <w:r>
               <w:rPr>
                 <w:sz w:val="18"/>
@@ -14599,6 +15232,7 @@
           </w:tcPr>
           <w:p>
             <w:pPr>
+              <w:spacing w:after="0"/>
               <w:jc w:val="center"/>
             </w:pPr>
             <w:r>
@@ -14628,6 +15262,9 @@
             </w:tcMar>
           </w:tcPr>
           <w:p>
+            <w:pPr>
+              <w:spacing w:after="0"/>
+            </w:pPr>
             <w:r>
               <w:rPr>
                 <w:b/>
@@ -14657,6 +15294,9 @@
             </w:tcMar>
           </w:tcPr>
           <w:p>
+            <w:pPr>
+              <w:spacing w:after="0"/>
+            </w:pPr>
             <w:r>
               <w:rPr>
                 <w:sz w:val="18"/>
@@ -14687,6 +15327,7 @@
           </w:tcPr>
           <w:p>
             <w:pPr>
+              <w:spacing w:after="0"/>
               <w:jc w:val="center"/>
             </w:pPr>
             <w:r>
@@ -14716,6 +15357,9 @@
             </w:tcMar>
           </w:tcPr>
           <w:p>
+            <w:pPr>
+              <w:spacing w:after="0"/>
+            </w:pPr>
             <w:r>
               <w:rPr>
                 <w:b/>
@@ -14745,6 +15389,9 @@
             </w:tcMar>
           </w:tcPr>
           <w:p>
+            <w:pPr>
+              <w:spacing w:after="0"/>
+            </w:pPr>
             <w:r>
               <w:rPr>
                 <w:sz w:val="18"/>
@@ -15614,7 +16261,7 @@
     </w:rPrDefault>
     <w:pPrDefault>
       <w:pPr>
-        <w:spacing w:after="160" w:line="259" w:lineRule="auto"/>
+        <w:spacing w:after="160"/>
       </w:pPr>
     </w:pPrDefault>
   </w:docDefaults>

</xml_diff>